<commit_message>
Add project name and team name to vision document and relevant READMEs
</commit_message>
<xml_diff>
--- a/docs/vision-document/Vision-Document.docx
+++ b/docs/vision-document/Vision-Document.docx
@@ -1,6 +1,6 @@
 
 <file path=word/document.xml><?xml version="1.0" encoding="utf-8"?>
-<w:document xmlns:wpc="http://schemas.microsoft.com/office/word/2010/wordprocessingCanvas" xmlns:cx="http://schemas.microsoft.com/office/drawing/2014/chartex" xmlns:cx1="http://schemas.microsoft.com/office/drawing/2015/9/8/chartex" xmlns:cx2="http://schemas.microsoft.com/office/drawing/2015/10/21/chartex" xmlns:cx3="http://schemas.microsoft.com/office/drawing/2016/5/9/chartex" xmlns:cx4="http://schemas.microsoft.com/office/drawing/2016/5/10/chartex" xmlns:cx5="http://schemas.microsoft.com/office/drawing/2016/5/11/chartex" xmlns:cx6="http://schemas.microsoft.com/office/drawing/2016/5/12/chartex" xmlns:cx7="http://schemas.microsoft.com/office/drawing/2016/5/13/chartex" xmlns:cx8="http://schemas.microsoft.com/office/drawing/2016/5/14/chartex" xmlns:mc="http://schemas.openxmlformats.org/markup-compatibility/2006" xmlns:aink="http://schemas.microsoft.com/office/drawing/2016/ink" xmlns:am3d="http://schemas.microsoft.com/office/drawing/2017/model3d" xmlns:o="urn:schemas-microsoft-com:office:office" xmlns:r="http://schemas.openxmlformats.org/officeDocument/2006/relationships" xmlns:m="http://schemas.openxmlformats.org/officeDocument/2006/math" xmlns:v="urn:schemas-microsoft-com:vml" xmlns:wp14="http://schemas.microsoft.com/office/word/2010/wordprocessingDrawing" xmlns:wp="http://schemas.openxmlformats.org/drawingml/2006/wordprocessingDrawing" xmlns:w10="urn:schemas-microsoft-com:office:word" xmlns:w="http://schemas.openxmlformats.org/wordprocessingml/2006/main" xmlns:w14="http://schemas.microsoft.com/office/word/2010/wordml" xmlns:w15="http://schemas.microsoft.com/office/word/2012/wordml" xmlns:w16cex="http://schemas.microsoft.com/office/word/2018/wordml/cex" xmlns:w16cid="http://schemas.microsoft.com/office/word/2016/wordml/cid" xmlns:w16="http://schemas.microsoft.com/office/word/2018/wordml" xmlns:w16se="http://schemas.microsoft.com/office/word/2015/wordml/symex" xmlns:wpg="http://schemas.microsoft.com/office/word/2010/wordprocessingGroup" xmlns:wpi="http://schemas.microsoft.com/office/word/2010/wordprocessingInk" xmlns:wne="http://schemas.microsoft.com/office/word/2006/wordml" xmlns:wps="http://schemas.microsoft.com/office/word/2010/wordprocessingShape" mc:Ignorable="w14 w15 w16se w16cid w16 w16cex wp14">
+<w:document xmlns:wpc="http://schemas.microsoft.com/office/word/2010/wordprocessingCanvas" xmlns:cx="http://schemas.microsoft.com/office/drawing/2014/chartex" xmlns:cx1="http://schemas.microsoft.com/office/drawing/2015/9/8/chartex" xmlns:cx2="http://schemas.microsoft.com/office/drawing/2015/10/21/chartex" xmlns:cx3="http://schemas.microsoft.com/office/drawing/2016/5/9/chartex" xmlns:cx4="http://schemas.microsoft.com/office/drawing/2016/5/10/chartex" xmlns:cx5="http://schemas.microsoft.com/office/drawing/2016/5/11/chartex" xmlns:cx6="http://schemas.microsoft.com/office/drawing/2016/5/12/chartex" xmlns:cx7="http://schemas.microsoft.com/office/drawing/2016/5/13/chartex" xmlns:cx8="http://schemas.microsoft.com/office/drawing/2016/5/14/chartex" xmlns:mc="http://schemas.openxmlformats.org/markup-compatibility/2006" xmlns:aink="http://schemas.microsoft.com/office/drawing/2016/ink" xmlns:am3d="http://schemas.microsoft.com/office/drawing/2017/model3d" xmlns:o="urn:schemas-microsoft-com:office:office" xmlns:oel="http://schemas.microsoft.com/office/2019/extlst" xmlns:r="http://schemas.openxmlformats.org/officeDocument/2006/relationships" xmlns:m="http://schemas.openxmlformats.org/officeDocument/2006/math" xmlns:v="urn:schemas-microsoft-com:vml" xmlns:wp14="http://schemas.microsoft.com/office/word/2010/wordprocessingDrawing" xmlns:wp="http://schemas.openxmlformats.org/drawingml/2006/wordprocessingDrawing" xmlns:w10="urn:schemas-microsoft-com:office:word" xmlns:w="http://schemas.openxmlformats.org/wordprocessingml/2006/main" xmlns:w14="http://schemas.microsoft.com/office/word/2010/wordml" xmlns:w15="http://schemas.microsoft.com/office/word/2012/wordml" xmlns:w16cex="http://schemas.microsoft.com/office/word/2018/wordml/cex" xmlns:w16cid="http://schemas.microsoft.com/office/word/2016/wordml/cid" xmlns:w16="http://schemas.microsoft.com/office/word/2018/wordml" xmlns:w16du="http://schemas.microsoft.com/office/word/2023/wordml/word16du" xmlns:w16sdtdh="http://schemas.microsoft.com/office/word/2020/wordml/sdtdatahash" xmlns:w16sdtfl="http://schemas.microsoft.com/office/word/2024/wordml/sdtformatlock" xmlns:w16se="http://schemas.microsoft.com/office/word/2015/wordml/symex" xmlns:wpg="http://schemas.microsoft.com/office/word/2010/wordprocessingGroup" xmlns:wpi="http://schemas.microsoft.com/office/word/2010/wordprocessingInk" xmlns:wne="http://schemas.microsoft.com/office/word/2006/wordml" xmlns:wps="http://schemas.microsoft.com/office/word/2010/wordprocessingShape" mc:Ignorable="w14 w15 w16se w16cid w16 w16cex w16sdtdh w16sdtfl w16du wp14">
   <w:body>
     <w:p>
       <w:pPr>
@@ -8,25 +8,7 @@
         <w:jc w:val="right"/>
       </w:pPr>
       <w:r>
-        <w:fldChar w:fldCharType="begin"/>
-      </w:r>
-      <w:r>
-        <w:instrText xml:space="preserve"> SUBJECT  \* MERGEFORMAT </w:instrText>
-      </w:r>
-      <w:r>
-        <w:fldChar w:fldCharType="separate"/>
-      </w:r>
-      <w:r>
-        <w:t>&lt;</w:t>
-      </w:r>
-      <w:r>
-        <w:t>Product Name</w:t>
-      </w:r>
-      <w:r>
-        <w:t>&gt;</w:t>
-      </w:r>
-      <w:r>
-        <w:fldChar w:fldCharType="end"/>
+        <w:t>Code Cupid</w:t>
       </w:r>
     </w:p>
     <w:p>
@@ -34,21 +16,11 @@
         <w:pStyle w:val="Title"/>
         <w:jc w:val="right"/>
       </w:pPr>
-      <w:r>
-        <w:fldChar w:fldCharType="begin"/>
-      </w:r>
-      <w:r>
-        <w:instrText xml:space="preserve"> TITLE  \* MERGEFORMAT </w:instrText>
-      </w:r>
-      <w:r>
-        <w:fldChar w:fldCharType="separate"/>
-      </w:r>
-      <w:r>
-        <w:t>Vision</w:t>
-      </w:r>
-      <w:r>
-        <w:fldChar w:fldCharType="end"/>
-      </w:r>
+      <w:fldSimple w:instr=" TITLE  \* MERGEFORMAT ">
+        <w:r>
+          <w:t>Vision</w:t>
+        </w:r>
+      </w:fldSimple>
     </w:p>
     <w:p>
       <w:pPr>
@@ -105,12 +77,7 @@
     <w:p>
       <w:pPr>
         <w:sectPr>
-          <w:headerReference w:type="even" r:id="rId7"/>
-          <w:headerReference w:type="default" r:id="rId8"/>
-          <w:footerReference w:type="even" r:id="rId9"/>
-          <w:footerReference w:type="default" r:id="rId10"/>
-          <w:headerReference w:type="first" r:id="rId11"/>
-          <w:footerReference w:type="first" r:id="rId12"/>
+          <w:headerReference w:type="default" r:id="rId7"/>
           <w:pgSz w:w="12240" w:h="15840" w:code="1"/>
           <w:pgMar w:top="1440" w:right="1440" w:bottom="1440" w:left="1440" w:header="720" w:footer="720" w:gutter="0"/>
           <w:cols w:space="720"/>
@@ -1928,7 +1895,15 @@
         <w:t xml:space="preserve">It is important that you differentiate your application from others that may exist in the marketplace. </w:t>
       </w:r>
       <w:r>
-        <w:t xml:space="preserve">Identify alternatives the stakeholder perceives as available. These can include buying a competitor’s product, building a homegrown solution or simply maintaining the status quo. List any known competitive choices that </w:t>
+        <w:t xml:space="preserve">Identify alternatives the stakeholder perceives as available. These can include buying a competitor’s product, building a homegrown solution or simply maintaining the status quo. </w:t>
+      </w:r>
+      <w:proofErr w:type="gramStart"/>
+      <w:r>
+        <w:t>List</w:t>
+      </w:r>
+      <w:proofErr w:type="gramEnd"/>
+      <w:r>
+        <w:t xml:space="preserve"> any known competitive choices that </w:t>
       </w:r>
       <w:proofErr w:type="gramStart"/>
       <w:r>
@@ -2010,16 +1985,11 @@
         <w:pStyle w:val="InfoBlue"/>
       </w:pPr>
       <w:r>
-        <w:t xml:space="preserve">[Provide a list of any perceived Business risks associated with the project, for example, there might be a market leader that dominates the market, Users may not perceive a need for the application, </w:t>
-      </w:r>
-      <w:proofErr w:type="gramStart"/>
-      <w:r>
-        <w:t xml:space="preserve">etc. </w:t>
+        <w:t xml:space="preserve">[Provide a list of any perceived Business risks associated with the project, for example, there might be a market leader that dominates the market, Users may not perceive a need for the application, etc. </w:t>
       </w:r>
       <w:r>
         <w:t>]</w:t>
       </w:r>
-      <w:proofErr w:type="gramEnd"/>
     </w:p>
     <w:p/>
     <w:p>
@@ -2188,32 +2158,35 @@
         </w:tc>
       </w:tr>
       <w:tr>
+        <w:trPr>
+          <w:trHeight w:val="453"/>
+        </w:trPr>
         <w:tc>
           <w:tcPr>
             <w:tcW w:w="2693" w:type="dxa"/>
           </w:tcPr>
           <w:p>
             <w:pPr>
+              <w:rPr>
+                <w:lang w:val="en-CA"/>
+              </w:rPr>
+            </w:pPr>
+            <w:r>
+              <w:rPr>
+                <w:lang w:val="en-CA"/>
+              </w:rPr>
+              <w:t>Unish Pandey</w:t>
+            </w:r>
+          </w:p>
+        </w:tc>
+        <w:tc>
+          <w:tcPr>
+            <w:tcW w:w="6379" w:type="dxa"/>
+          </w:tcPr>
+          <w:p>
+            <w:pPr>
               <w:pStyle w:val="InfoBlue"/>
-            </w:pPr>
-            <w:r>
-              <w:t xml:space="preserve">[Name </w:t>
-            </w:r>
-            <w:r>
-              <w:t>of each</w:t>
-            </w:r>
-            <w:r>
-              <w:t xml:space="preserve"> team member.]</w:t>
-            </w:r>
-          </w:p>
-        </w:tc>
-        <w:tc>
-          <w:tcPr>
-            <w:tcW w:w="6379" w:type="dxa"/>
-          </w:tcPr>
-          <w:p>
-            <w:pPr>
-              <w:pStyle w:val="InfoBlue"/>
+              <w:spacing w:after="0"/>
             </w:pPr>
             <w:r>
               <w:t xml:space="preserve">[Summarize the </w:t>
@@ -2222,7 +2195,15 @@
               <w:t>team member’</w:t>
             </w:r>
             <w:r>
-              <w:t>s key responsibilities with regard to the system being developed</w:t>
+              <w:t xml:space="preserve">s key responsibilities </w:t>
+            </w:r>
+            <w:proofErr w:type="gramStart"/>
+            <w:r>
+              <w:t>with regard to</w:t>
+            </w:r>
+            <w:proofErr w:type="gramEnd"/>
+            <w:r>
+              <w:t xml:space="preserve"> the system being developed</w:t>
             </w:r>
             <w:r>
               <w:t xml:space="preserve">. </w:t>
@@ -2238,6 +2219,7 @@
                 <w:ilvl w:val="0"/>
                 <w:numId w:val="29"/>
               </w:numPr>
+              <w:spacing w:after="0"/>
             </w:pPr>
             <w:r>
               <w:t>taking on the role of a scrum master</w:t>
@@ -2250,6 +2232,7 @@
                 <w:ilvl w:val="0"/>
                 <w:numId w:val="29"/>
               </w:numPr>
+              <w:spacing w:after="0"/>
             </w:pPr>
             <w:r>
               <w:t xml:space="preserve">responsible for </w:t>
@@ -2265,6 +2248,7 @@
                 <w:ilvl w:val="0"/>
                 <w:numId w:val="29"/>
               </w:numPr>
+              <w:spacing w:after="0"/>
             </w:pPr>
             <w:r>
               <w:t xml:space="preserve">responsible for the design of </w:t>
@@ -2280,10 +2264,143 @@
                 <w:ilvl w:val="0"/>
                 <w:numId w:val="29"/>
               </w:numPr>
+              <w:spacing w:after="0"/>
             </w:pPr>
             <w:r>
               <w:t>and so forth]</w:t>
             </w:r>
+          </w:p>
+        </w:tc>
+      </w:tr>
+      <w:tr>
+        <w:trPr>
+          <w:trHeight w:val="156"/>
+        </w:trPr>
+        <w:tc>
+          <w:tcPr>
+            <w:tcW w:w="2693" w:type="dxa"/>
+          </w:tcPr>
+          <w:p>
+            <w:pPr>
+              <w:rPr>
+                <w:lang w:val="en-CA"/>
+              </w:rPr>
+            </w:pPr>
+            <w:r>
+              <w:rPr>
+                <w:lang w:val="en-CA"/>
+              </w:rPr>
+              <w:t>Kyan Oberas</w:t>
+            </w:r>
+          </w:p>
+        </w:tc>
+        <w:tc>
+          <w:tcPr>
+            <w:tcW w:w="6379" w:type="dxa"/>
+          </w:tcPr>
+          <w:p>
+            <w:pPr>
+              <w:pStyle w:val="InfoBlue"/>
+            </w:pPr>
+          </w:p>
+        </w:tc>
+      </w:tr>
+      <w:tr>
+        <w:trPr>
+          <w:trHeight w:val="156"/>
+        </w:trPr>
+        <w:tc>
+          <w:tcPr>
+            <w:tcW w:w="2693" w:type="dxa"/>
+          </w:tcPr>
+          <w:p>
+            <w:pPr>
+              <w:rPr>
+                <w:lang w:val="en-CA"/>
+              </w:rPr>
+            </w:pPr>
+            <w:r>
+              <w:rPr>
+                <w:lang w:val="en-CA"/>
+              </w:rPr>
+              <w:t>Mason L'Etoile</w:t>
+            </w:r>
+          </w:p>
+        </w:tc>
+        <w:tc>
+          <w:tcPr>
+            <w:tcW w:w="6379" w:type="dxa"/>
+          </w:tcPr>
+          <w:p>
+            <w:pPr>
+              <w:pStyle w:val="InfoBlue"/>
+            </w:pPr>
+          </w:p>
+        </w:tc>
+      </w:tr>
+      <w:tr>
+        <w:trPr>
+          <w:trHeight w:val="228"/>
+        </w:trPr>
+        <w:tc>
+          <w:tcPr>
+            <w:tcW w:w="2693" w:type="dxa"/>
+          </w:tcPr>
+          <w:p>
+            <w:pPr>
+              <w:rPr>
+                <w:lang w:val="en-CA"/>
+              </w:rPr>
+            </w:pPr>
+            <w:r>
+              <w:rPr>
+                <w:lang w:val="en-CA"/>
+              </w:rPr>
+              <w:t>Joseph Jaikaran</w:t>
+            </w:r>
+          </w:p>
+        </w:tc>
+        <w:tc>
+          <w:tcPr>
+            <w:tcW w:w="6379" w:type="dxa"/>
+          </w:tcPr>
+          <w:p>
+            <w:pPr>
+              <w:pStyle w:val="InfoBlue"/>
+            </w:pPr>
+          </w:p>
+        </w:tc>
+      </w:tr>
+      <w:tr>
+        <w:trPr>
+          <w:trHeight w:val="210"/>
+        </w:trPr>
+        <w:tc>
+          <w:tcPr>
+            <w:tcW w:w="2693" w:type="dxa"/>
+          </w:tcPr>
+          <w:p>
+            <w:pPr>
+              <w:rPr>
+                <w:lang w:val="en-CA"/>
+              </w:rPr>
+            </w:pPr>
+            <w:r>
+              <w:rPr>
+                <w:lang w:val="en-CA"/>
+              </w:rPr>
+              <w:t>Ahmed Elmardi O Ibrahim</w:t>
+            </w:r>
+          </w:p>
+        </w:tc>
+        <w:tc>
+          <w:tcPr>
+            <w:tcW w:w="6379" w:type="dxa"/>
+          </w:tcPr>
+          <w:p>
+            <w:pPr>
+              <w:pStyle w:val="InfoBlue"/>
+            </w:pPr>
           </w:p>
         </w:tc>
       </w:tr>
@@ -2465,8 +2582,8 @@
       <w:pPr>
         <w:pStyle w:val="Heading1"/>
         <w:sectPr>
-          <w:headerReference w:type="default" r:id="rId13"/>
-          <w:footerReference w:type="default" r:id="rId14"/>
+          <w:headerReference w:type="default" r:id="rId8"/>
+          <w:footerReference w:type="default" r:id="rId9"/>
           <w:pgSz w:w="12240" w:h="15840" w:code="1"/>
           <w:pgMar w:top="1440" w:right="1440" w:bottom="1440" w:left="1440" w:header="720" w:footer="720" w:gutter="0"/>
           <w:cols w:space="720"/>
@@ -5241,7 +5358,7 @@
 </file>
 
 <file path=word/endnotes.xml><?xml version="1.0" encoding="utf-8"?>
-<w:endnotes xmlns:wpc="http://schemas.microsoft.com/office/word/2010/wordprocessingCanvas" xmlns:cx="http://schemas.microsoft.com/office/drawing/2014/chartex" xmlns:cx1="http://schemas.microsoft.com/office/drawing/2015/9/8/chartex" xmlns:cx2="http://schemas.microsoft.com/office/drawing/2015/10/21/chartex" xmlns:cx3="http://schemas.microsoft.com/office/drawing/2016/5/9/chartex" xmlns:cx4="http://schemas.microsoft.com/office/drawing/2016/5/10/chartex" xmlns:cx5="http://schemas.microsoft.com/office/drawing/2016/5/11/chartex" xmlns:cx6="http://schemas.microsoft.com/office/drawing/2016/5/12/chartex" xmlns:cx7="http://schemas.microsoft.com/office/drawing/2016/5/13/chartex" xmlns:cx8="http://schemas.microsoft.com/office/drawing/2016/5/14/chartex" xmlns:mc="http://schemas.openxmlformats.org/markup-compatibility/2006" xmlns:aink="http://schemas.microsoft.com/office/drawing/2016/ink" xmlns:am3d="http://schemas.microsoft.com/office/drawing/2017/model3d" xmlns:o="urn:schemas-microsoft-com:office:office" xmlns:r="http://schemas.openxmlformats.org/officeDocument/2006/relationships" xmlns:m="http://schemas.openxmlformats.org/officeDocument/2006/math" xmlns:v="urn:schemas-microsoft-com:vml" xmlns:wp14="http://schemas.microsoft.com/office/word/2010/wordprocessingDrawing" xmlns:wp="http://schemas.openxmlformats.org/drawingml/2006/wordprocessingDrawing" xmlns:w10="urn:schemas-microsoft-com:office:word" xmlns:w="http://schemas.openxmlformats.org/wordprocessingml/2006/main" xmlns:w14="http://schemas.microsoft.com/office/word/2010/wordml" xmlns:w15="http://schemas.microsoft.com/office/word/2012/wordml" xmlns:w16cex="http://schemas.microsoft.com/office/word/2018/wordml/cex" xmlns:w16cid="http://schemas.microsoft.com/office/word/2016/wordml/cid" xmlns:w16="http://schemas.microsoft.com/office/word/2018/wordml" xmlns:w16se="http://schemas.microsoft.com/office/word/2015/wordml/symex" xmlns:wpg="http://schemas.microsoft.com/office/word/2010/wordprocessingGroup" xmlns:wpi="http://schemas.microsoft.com/office/word/2010/wordprocessingInk" xmlns:wne="http://schemas.microsoft.com/office/word/2006/wordml" xmlns:wps="http://schemas.microsoft.com/office/word/2010/wordprocessingShape" mc:Ignorable="w14 w15 w16se w16cid w16 w16cex wp14">
+<w:endnotes xmlns:wpc="http://schemas.microsoft.com/office/word/2010/wordprocessingCanvas" xmlns:cx="http://schemas.microsoft.com/office/drawing/2014/chartex" xmlns:cx1="http://schemas.microsoft.com/office/drawing/2015/9/8/chartex" xmlns:cx2="http://schemas.microsoft.com/office/drawing/2015/10/21/chartex" xmlns:cx3="http://schemas.microsoft.com/office/drawing/2016/5/9/chartex" xmlns:cx4="http://schemas.microsoft.com/office/drawing/2016/5/10/chartex" xmlns:cx5="http://schemas.microsoft.com/office/drawing/2016/5/11/chartex" xmlns:cx6="http://schemas.microsoft.com/office/drawing/2016/5/12/chartex" xmlns:cx7="http://schemas.microsoft.com/office/drawing/2016/5/13/chartex" xmlns:cx8="http://schemas.microsoft.com/office/drawing/2016/5/14/chartex" xmlns:mc="http://schemas.openxmlformats.org/markup-compatibility/2006" xmlns:aink="http://schemas.microsoft.com/office/drawing/2016/ink" xmlns:am3d="http://schemas.microsoft.com/office/drawing/2017/model3d" xmlns:o="urn:schemas-microsoft-com:office:office" xmlns:oel="http://schemas.microsoft.com/office/2019/extlst" xmlns:r="http://schemas.openxmlformats.org/officeDocument/2006/relationships" xmlns:m="http://schemas.openxmlformats.org/officeDocument/2006/math" xmlns:v="urn:schemas-microsoft-com:vml" xmlns:wp14="http://schemas.microsoft.com/office/word/2010/wordprocessingDrawing" xmlns:wp="http://schemas.openxmlformats.org/drawingml/2006/wordprocessingDrawing" xmlns:w10="urn:schemas-microsoft-com:office:word" xmlns:w="http://schemas.openxmlformats.org/wordprocessingml/2006/main" xmlns:w14="http://schemas.microsoft.com/office/word/2010/wordml" xmlns:w15="http://schemas.microsoft.com/office/word/2012/wordml" xmlns:w16cex="http://schemas.microsoft.com/office/word/2018/wordml/cex" xmlns:w16cid="http://schemas.microsoft.com/office/word/2016/wordml/cid" xmlns:w16="http://schemas.microsoft.com/office/word/2018/wordml" xmlns:w16du="http://schemas.microsoft.com/office/word/2023/wordml/word16du" xmlns:w16sdtdh="http://schemas.microsoft.com/office/word/2020/wordml/sdtdatahash" xmlns:w16sdtfl="http://schemas.microsoft.com/office/word/2024/wordml/sdtformatlock" xmlns:w16se="http://schemas.microsoft.com/office/word/2015/wordml/symex" xmlns:wpg="http://schemas.microsoft.com/office/word/2010/wordprocessingGroup" xmlns:wpi="http://schemas.microsoft.com/office/word/2010/wordprocessingInk" xmlns:wne="http://schemas.microsoft.com/office/word/2006/wordml" xmlns:wps="http://schemas.microsoft.com/office/word/2010/wordprocessingShape" mc:Ignorable="w14 w15 w16se w16cid w16 w16cex w16sdtdh w16sdtfl w16du wp14">
   <w:endnote w:type="separator" w:id="-1">
     <w:p>
       <w:r>
@@ -5260,37 +5377,7 @@
 </file>
 
 <file path=word/footer1.xml><?xml version="1.0" encoding="utf-8"?>
-<w:ftr xmlns:wpc="http://schemas.microsoft.com/office/word/2010/wordprocessingCanvas" xmlns:cx="http://schemas.microsoft.com/office/drawing/2014/chartex" xmlns:cx1="http://schemas.microsoft.com/office/drawing/2015/9/8/chartex" xmlns:cx2="http://schemas.microsoft.com/office/drawing/2015/10/21/chartex" xmlns:cx3="http://schemas.microsoft.com/office/drawing/2016/5/9/chartex" xmlns:cx4="http://schemas.microsoft.com/office/drawing/2016/5/10/chartex" xmlns:cx5="http://schemas.microsoft.com/office/drawing/2016/5/11/chartex" xmlns:cx6="http://schemas.microsoft.com/office/drawing/2016/5/12/chartex" xmlns:cx7="http://schemas.microsoft.com/office/drawing/2016/5/13/chartex" xmlns:cx8="http://schemas.microsoft.com/office/drawing/2016/5/14/chartex" xmlns:mc="http://schemas.openxmlformats.org/markup-compatibility/2006" xmlns:aink="http://schemas.microsoft.com/office/drawing/2016/ink" xmlns:am3d="http://schemas.microsoft.com/office/drawing/2017/model3d" xmlns:o="urn:schemas-microsoft-com:office:office" xmlns:r="http://schemas.openxmlformats.org/officeDocument/2006/relationships" xmlns:m="http://schemas.openxmlformats.org/officeDocument/2006/math" xmlns:v="urn:schemas-microsoft-com:vml" xmlns:wp14="http://schemas.microsoft.com/office/word/2010/wordprocessingDrawing" xmlns:wp="http://schemas.openxmlformats.org/drawingml/2006/wordprocessingDrawing" xmlns:w10="urn:schemas-microsoft-com:office:word" xmlns:w="http://schemas.openxmlformats.org/wordprocessingml/2006/main" xmlns:w14="http://schemas.microsoft.com/office/word/2010/wordml" xmlns:w15="http://schemas.microsoft.com/office/word/2012/wordml" xmlns:w16cex="http://schemas.microsoft.com/office/word/2018/wordml/cex" xmlns:w16cid="http://schemas.microsoft.com/office/word/2016/wordml/cid" xmlns:w16="http://schemas.microsoft.com/office/word/2018/wordml" xmlns:w16se="http://schemas.microsoft.com/office/word/2015/wordml/symex" xmlns:wpg="http://schemas.microsoft.com/office/word/2010/wordprocessingGroup" xmlns:wpi="http://schemas.microsoft.com/office/word/2010/wordprocessingInk" xmlns:wne="http://schemas.microsoft.com/office/word/2006/wordml" xmlns:wps="http://schemas.microsoft.com/office/word/2010/wordprocessingShape" mc:Ignorable="w14 w15 w16se w16cid w16 w16cex wp14">
-  <w:p>
-    <w:pPr>
-      <w:pStyle w:val="Footer"/>
-    </w:pPr>
-  </w:p>
-</w:ftr>
-</file>
-
-<file path=word/footer2.xml><?xml version="1.0" encoding="utf-8"?>
-<w:ftr xmlns:wpc="http://schemas.microsoft.com/office/word/2010/wordprocessingCanvas" xmlns:cx="http://schemas.microsoft.com/office/drawing/2014/chartex" xmlns:cx1="http://schemas.microsoft.com/office/drawing/2015/9/8/chartex" xmlns:cx2="http://schemas.microsoft.com/office/drawing/2015/10/21/chartex" xmlns:cx3="http://schemas.microsoft.com/office/drawing/2016/5/9/chartex" xmlns:cx4="http://schemas.microsoft.com/office/drawing/2016/5/10/chartex" xmlns:cx5="http://schemas.microsoft.com/office/drawing/2016/5/11/chartex" xmlns:cx6="http://schemas.microsoft.com/office/drawing/2016/5/12/chartex" xmlns:cx7="http://schemas.microsoft.com/office/drawing/2016/5/13/chartex" xmlns:cx8="http://schemas.microsoft.com/office/drawing/2016/5/14/chartex" xmlns:mc="http://schemas.openxmlformats.org/markup-compatibility/2006" xmlns:aink="http://schemas.microsoft.com/office/drawing/2016/ink" xmlns:am3d="http://schemas.microsoft.com/office/drawing/2017/model3d" xmlns:o="urn:schemas-microsoft-com:office:office" xmlns:r="http://schemas.openxmlformats.org/officeDocument/2006/relationships" xmlns:m="http://schemas.openxmlformats.org/officeDocument/2006/math" xmlns:v="urn:schemas-microsoft-com:vml" xmlns:wp14="http://schemas.microsoft.com/office/word/2010/wordprocessingDrawing" xmlns:wp="http://schemas.openxmlformats.org/drawingml/2006/wordprocessingDrawing" xmlns:w10="urn:schemas-microsoft-com:office:word" xmlns:w="http://schemas.openxmlformats.org/wordprocessingml/2006/main" xmlns:w14="http://schemas.microsoft.com/office/word/2010/wordml" xmlns:w15="http://schemas.microsoft.com/office/word/2012/wordml" xmlns:w16cex="http://schemas.microsoft.com/office/word/2018/wordml/cex" xmlns:w16cid="http://schemas.microsoft.com/office/word/2016/wordml/cid" xmlns:w16="http://schemas.microsoft.com/office/word/2018/wordml" xmlns:w16se="http://schemas.microsoft.com/office/word/2015/wordml/symex" xmlns:wpg="http://schemas.microsoft.com/office/word/2010/wordprocessingGroup" xmlns:wpi="http://schemas.microsoft.com/office/word/2010/wordprocessingInk" xmlns:wne="http://schemas.microsoft.com/office/word/2006/wordml" xmlns:wps="http://schemas.microsoft.com/office/word/2010/wordprocessingShape" mc:Ignorable="w14 w15 w16se w16cid w16 w16cex wp14">
-  <w:p>
-    <w:pPr>
-      <w:pStyle w:val="Footer"/>
-    </w:pPr>
-  </w:p>
-</w:ftr>
-</file>
-
-<file path=word/footer3.xml><?xml version="1.0" encoding="utf-8"?>
-<w:ftr xmlns:wpc="http://schemas.microsoft.com/office/word/2010/wordprocessingCanvas" xmlns:cx="http://schemas.microsoft.com/office/drawing/2014/chartex" xmlns:cx1="http://schemas.microsoft.com/office/drawing/2015/9/8/chartex" xmlns:cx2="http://schemas.microsoft.com/office/drawing/2015/10/21/chartex" xmlns:cx3="http://schemas.microsoft.com/office/drawing/2016/5/9/chartex" xmlns:cx4="http://schemas.microsoft.com/office/drawing/2016/5/10/chartex" xmlns:cx5="http://schemas.microsoft.com/office/drawing/2016/5/11/chartex" xmlns:cx6="http://schemas.microsoft.com/office/drawing/2016/5/12/chartex" xmlns:cx7="http://schemas.microsoft.com/office/drawing/2016/5/13/chartex" xmlns:cx8="http://schemas.microsoft.com/office/drawing/2016/5/14/chartex" xmlns:mc="http://schemas.openxmlformats.org/markup-compatibility/2006" xmlns:aink="http://schemas.microsoft.com/office/drawing/2016/ink" xmlns:am3d="http://schemas.microsoft.com/office/drawing/2017/model3d" xmlns:o="urn:schemas-microsoft-com:office:office" xmlns:r="http://schemas.openxmlformats.org/officeDocument/2006/relationships" xmlns:m="http://schemas.openxmlformats.org/officeDocument/2006/math" xmlns:v="urn:schemas-microsoft-com:vml" xmlns:wp14="http://schemas.microsoft.com/office/word/2010/wordprocessingDrawing" xmlns:wp="http://schemas.openxmlformats.org/drawingml/2006/wordprocessingDrawing" xmlns:w10="urn:schemas-microsoft-com:office:word" xmlns:w="http://schemas.openxmlformats.org/wordprocessingml/2006/main" xmlns:w14="http://schemas.microsoft.com/office/word/2010/wordml" xmlns:w15="http://schemas.microsoft.com/office/word/2012/wordml" xmlns:w16cex="http://schemas.microsoft.com/office/word/2018/wordml/cex" xmlns:w16cid="http://schemas.microsoft.com/office/word/2016/wordml/cid" xmlns:w16="http://schemas.microsoft.com/office/word/2018/wordml" xmlns:w16se="http://schemas.microsoft.com/office/word/2015/wordml/symex" xmlns:wpg="http://schemas.microsoft.com/office/word/2010/wordprocessingGroup" xmlns:wpi="http://schemas.microsoft.com/office/word/2010/wordprocessingInk" xmlns:wne="http://schemas.microsoft.com/office/word/2006/wordml" xmlns:wps="http://schemas.microsoft.com/office/word/2010/wordprocessingShape" mc:Ignorable="w14 w15 w16se w16cid w16 w16cex wp14">
-  <w:p>
-    <w:pPr>
-      <w:pStyle w:val="Footer"/>
-    </w:pPr>
-  </w:p>
-</w:ftr>
-</file>
-
-<file path=word/footer4.xml><?xml version="1.0" encoding="utf-8"?>
-<w:ftr xmlns:wpc="http://schemas.microsoft.com/office/word/2010/wordprocessingCanvas" xmlns:cx="http://schemas.microsoft.com/office/drawing/2014/chartex" xmlns:cx1="http://schemas.microsoft.com/office/drawing/2015/9/8/chartex" xmlns:cx2="http://schemas.microsoft.com/office/drawing/2015/10/21/chartex" xmlns:cx3="http://schemas.microsoft.com/office/drawing/2016/5/9/chartex" xmlns:cx4="http://schemas.microsoft.com/office/drawing/2016/5/10/chartex" xmlns:cx5="http://schemas.microsoft.com/office/drawing/2016/5/11/chartex" xmlns:cx6="http://schemas.microsoft.com/office/drawing/2016/5/12/chartex" xmlns:cx7="http://schemas.microsoft.com/office/drawing/2016/5/13/chartex" xmlns:cx8="http://schemas.microsoft.com/office/drawing/2016/5/14/chartex" xmlns:mc="http://schemas.openxmlformats.org/markup-compatibility/2006" xmlns:aink="http://schemas.microsoft.com/office/drawing/2016/ink" xmlns:am3d="http://schemas.microsoft.com/office/drawing/2017/model3d" xmlns:o="urn:schemas-microsoft-com:office:office" xmlns:r="http://schemas.openxmlformats.org/officeDocument/2006/relationships" xmlns:m="http://schemas.openxmlformats.org/officeDocument/2006/math" xmlns:v="urn:schemas-microsoft-com:vml" xmlns:wp14="http://schemas.microsoft.com/office/word/2010/wordprocessingDrawing" xmlns:wp="http://schemas.openxmlformats.org/drawingml/2006/wordprocessingDrawing" xmlns:w10="urn:schemas-microsoft-com:office:word" xmlns:w="http://schemas.openxmlformats.org/wordprocessingml/2006/main" xmlns:w14="http://schemas.microsoft.com/office/word/2010/wordml" xmlns:w15="http://schemas.microsoft.com/office/word/2012/wordml" xmlns:w16cex="http://schemas.microsoft.com/office/word/2018/wordml/cex" xmlns:w16cid="http://schemas.microsoft.com/office/word/2016/wordml/cid" xmlns:w16="http://schemas.microsoft.com/office/word/2018/wordml" xmlns:w16se="http://schemas.microsoft.com/office/word/2015/wordml/symex" xmlns:wpg="http://schemas.microsoft.com/office/word/2010/wordprocessingGroup" xmlns:wpi="http://schemas.microsoft.com/office/word/2010/wordprocessingInk" xmlns:wne="http://schemas.microsoft.com/office/word/2006/wordml" xmlns:wps="http://schemas.microsoft.com/office/word/2010/wordprocessingShape" mc:Ignorable="w14 w15 w16se w16cid w16 w16cex wp14">
+<w:ftr xmlns:wpc="http://schemas.microsoft.com/office/word/2010/wordprocessingCanvas" xmlns:cx="http://schemas.microsoft.com/office/drawing/2014/chartex" xmlns:cx1="http://schemas.microsoft.com/office/drawing/2015/9/8/chartex" xmlns:cx2="http://schemas.microsoft.com/office/drawing/2015/10/21/chartex" xmlns:cx3="http://schemas.microsoft.com/office/drawing/2016/5/9/chartex" xmlns:cx4="http://schemas.microsoft.com/office/drawing/2016/5/10/chartex" xmlns:cx5="http://schemas.microsoft.com/office/drawing/2016/5/11/chartex" xmlns:cx6="http://schemas.microsoft.com/office/drawing/2016/5/12/chartex" xmlns:cx7="http://schemas.microsoft.com/office/drawing/2016/5/13/chartex" xmlns:cx8="http://schemas.microsoft.com/office/drawing/2016/5/14/chartex" xmlns:mc="http://schemas.openxmlformats.org/markup-compatibility/2006" xmlns:aink="http://schemas.microsoft.com/office/drawing/2016/ink" xmlns:am3d="http://schemas.microsoft.com/office/drawing/2017/model3d" xmlns:o="urn:schemas-microsoft-com:office:office" xmlns:oel="http://schemas.microsoft.com/office/2019/extlst" xmlns:r="http://schemas.openxmlformats.org/officeDocument/2006/relationships" xmlns:m="http://schemas.openxmlformats.org/officeDocument/2006/math" xmlns:v="urn:schemas-microsoft-com:vml" xmlns:wp14="http://schemas.microsoft.com/office/word/2010/wordprocessingDrawing" xmlns:wp="http://schemas.openxmlformats.org/drawingml/2006/wordprocessingDrawing" xmlns:w10="urn:schemas-microsoft-com:office:word" xmlns:w="http://schemas.openxmlformats.org/wordprocessingml/2006/main" xmlns:w14="http://schemas.microsoft.com/office/word/2010/wordml" xmlns:w15="http://schemas.microsoft.com/office/word/2012/wordml" xmlns:w16cex="http://schemas.microsoft.com/office/word/2018/wordml/cex" xmlns:w16cid="http://schemas.microsoft.com/office/word/2016/wordml/cid" xmlns:w16="http://schemas.microsoft.com/office/word/2018/wordml" xmlns:w16du="http://schemas.microsoft.com/office/word/2023/wordml/word16du" xmlns:w16sdtdh="http://schemas.microsoft.com/office/word/2020/wordml/sdtdatahash" xmlns:w16sdtfl="http://schemas.microsoft.com/office/word/2024/wordml/sdtformatlock" xmlns:w16se="http://schemas.microsoft.com/office/word/2015/wordml/symex" xmlns:wpg="http://schemas.microsoft.com/office/word/2010/wordprocessingGroup" xmlns:wpi="http://schemas.microsoft.com/office/word/2010/wordprocessingInk" xmlns:wne="http://schemas.microsoft.com/office/word/2006/wordml" xmlns:wps="http://schemas.microsoft.com/office/word/2010/wordprocessingShape" mc:Ignorable="w14 w15 w16se w16cid w16 w16cex w16sdtdh w16sdtfl w16du wp14">
   <w:tbl>
     <w:tblPr>
       <w:tblW w:w="0" w:type="auto"/>
@@ -5347,21 +5434,11 @@
           <w:r>
             <w:sym w:font="Symbol" w:char="F0D3"/>
           </w:r>
-          <w:r>
-            <w:fldChar w:fldCharType="begin"/>
-          </w:r>
-          <w:r>
-            <w:instrText xml:space="preserve"> DOCPROPERTY "Company"  \* MERGEFORMAT </w:instrText>
-          </w:r>
-          <w:r>
-            <w:fldChar w:fldCharType="separate"/>
-          </w:r>
-          <w:r>
-            <w:t>&lt;Team Name&gt;</w:t>
-          </w:r>
-          <w:r>
-            <w:fldChar w:fldCharType="end"/>
-          </w:r>
+          <w:fldSimple w:instr=" DOCPROPERTY &quot;Company&quot;  \* MERGEFORMAT ">
+            <w:r>
+              <w:t>Code Cupid Coders</w:t>
+            </w:r>
+          </w:fldSimple>
           <w:r>
             <w:t xml:space="preserve">, </w:t>
           </w:r>
@@ -5378,7 +5455,7 @@
             <w:rPr>
               <w:noProof/>
             </w:rPr>
-            <w:t>2020</w:t>
+            <w:t>2026</w:t>
           </w:r>
           <w:r>
             <w:fldChar w:fldCharType="end"/>
@@ -5446,7 +5523,7 @@
 </file>
 
 <file path=word/footnotes.xml><?xml version="1.0" encoding="utf-8"?>
-<w:footnotes xmlns:wpc="http://schemas.microsoft.com/office/word/2010/wordprocessingCanvas" xmlns:cx="http://schemas.microsoft.com/office/drawing/2014/chartex" xmlns:cx1="http://schemas.microsoft.com/office/drawing/2015/9/8/chartex" xmlns:cx2="http://schemas.microsoft.com/office/drawing/2015/10/21/chartex" xmlns:cx3="http://schemas.microsoft.com/office/drawing/2016/5/9/chartex" xmlns:cx4="http://schemas.microsoft.com/office/drawing/2016/5/10/chartex" xmlns:cx5="http://schemas.microsoft.com/office/drawing/2016/5/11/chartex" xmlns:cx6="http://schemas.microsoft.com/office/drawing/2016/5/12/chartex" xmlns:cx7="http://schemas.microsoft.com/office/drawing/2016/5/13/chartex" xmlns:cx8="http://schemas.microsoft.com/office/drawing/2016/5/14/chartex" xmlns:mc="http://schemas.openxmlformats.org/markup-compatibility/2006" xmlns:aink="http://schemas.microsoft.com/office/drawing/2016/ink" xmlns:am3d="http://schemas.microsoft.com/office/drawing/2017/model3d" xmlns:o="urn:schemas-microsoft-com:office:office" xmlns:r="http://schemas.openxmlformats.org/officeDocument/2006/relationships" xmlns:m="http://schemas.openxmlformats.org/officeDocument/2006/math" xmlns:v="urn:schemas-microsoft-com:vml" xmlns:wp14="http://schemas.microsoft.com/office/word/2010/wordprocessingDrawing" xmlns:wp="http://schemas.openxmlformats.org/drawingml/2006/wordprocessingDrawing" xmlns:w10="urn:schemas-microsoft-com:office:word" xmlns:w="http://schemas.openxmlformats.org/wordprocessingml/2006/main" xmlns:w14="http://schemas.microsoft.com/office/word/2010/wordml" xmlns:w15="http://schemas.microsoft.com/office/word/2012/wordml" xmlns:w16cex="http://schemas.microsoft.com/office/word/2018/wordml/cex" xmlns:w16cid="http://schemas.microsoft.com/office/word/2016/wordml/cid" xmlns:w16="http://schemas.microsoft.com/office/word/2018/wordml" xmlns:w16se="http://schemas.microsoft.com/office/word/2015/wordml/symex" xmlns:wpg="http://schemas.microsoft.com/office/word/2010/wordprocessingGroup" xmlns:wpi="http://schemas.microsoft.com/office/word/2010/wordprocessingInk" xmlns:wne="http://schemas.microsoft.com/office/word/2006/wordml" xmlns:wps="http://schemas.microsoft.com/office/word/2010/wordprocessingShape" mc:Ignorable="w14 w15 w16se w16cid w16 w16cex wp14">
+<w:footnotes xmlns:wpc="http://schemas.microsoft.com/office/word/2010/wordprocessingCanvas" xmlns:cx="http://schemas.microsoft.com/office/drawing/2014/chartex" xmlns:cx1="http://schemas.microsoft.com/office/drawing/2015/9/8/chartex" xmlns:cx2="http://schemas.microsoft.com/office/drawing/2015/10/21/chartex" xmlns:cx3="http://schemas.microsoft.com/office/drawing/2016/5/9/chartex" xmlns:cx4="http://schemas.microsoft.com/office/drawing/2016/5/10/chartex" xmlns:cx5="http://schemas.microsoft.com/office/drawing/2016/5/11/chartex" xmlns:cx6="http://schemas.microsoft.com/office/drawing/2016/5/12/chartex" xmlns:cx7="http://schemas.microsoft.com/office/drawing/2016/5/13/chartex" xmlns:cx8="http://schemas.microsoft.com/office/drawing/2016/5/14/chartex" xmlns:mc="http://schemas.openxmlformats.org/markup-compatibility/2006" xmlns:aink="http://schemas.microsoft.com/office/drawing/2016/ink" xmlns:am3d="http://schemas.microsoft.com/office/drawing/2017/model3d" xmlns:o="urn:schemas-microsoft-com:office:office" xmlns:oel="http://schemas.microsoft.com/office/2019/extlst" xmlns:r="http://schemas.openxmlformats.org/officeDocument/2006/relationships" xmlns:m="http://schemas.openxmlformats.org/officeDocument/2006/math" xmlns:v="urn:schemas-microsoft-com:vml" xmlns:wp14="http://schemas.microsoft.com/office/word/2010/wordprocessingDrawing" xmlns:wp="http://schemas.openxmlformats.org/drawingml/2006/wordprocessingDrawing" xmlns:w10="urn:schemas-microsoft-com:office:word" xmlns:w="http://schemas.openxmlformats.org/wordprocessingml/2006/main" xmlns:w14="http://schemas.microsoft.com/office/word/2010/wordml" xmlns:w15="http://schemas.microsoft.com/office/word/2012/wordml" xmlns:w16cex="http://schemas.microsoft.com/office/word/2018/wordml/cex" xmlns:w16cid="http://schemas.microsoft.com/office/word/2016/wordml/cid" xmlns:w16="http://schemas.microsoft.com/office/word/2018/wordml" xmlns:w16du="http://schemas.microsoft.com/office/word/2023/wordml/word16du" xmlns:w16sdtdh="http://schemas.microsoft.com/office/word/2020/wordml/sdtdatahash" xmlns:w16sdtfl="http://schemas.microsoft.com/office/word/2024/wordml/sdtformatlock" xmlns:w16se="http://schemas.microsoft.com/office/word/2015/wordml/symex" xmlns:wpg="http://schemas.microsoft.com/office/word/2010/wordprocessingGroup" xmlns:wpi="http://schemas.microsoft.com/office/word/2010/wordprocessingInk" xmlns:wne="http://schemas.microsoft.com/office/word/2006/wordml" xmlns:wps="http://schemas.microsoft.com/office/word/2010/wordprocessingShape" mc:Ignorable="w14 w15 w16se w16cid w16 w16cex w16sdtdh w16sdtfl w16du wp14">
   <w:footnote w:type="separator" w:id="-1">
     <w:p>
       <w:r>
@@ -5465,17 +5542,7 @@
 </file>
 
 <file path=word/header1.xml><?xml version="1.0" encoding="utf-8"?>
-<w:hdr xmlns:wpc="http://schemas.microsoft.com/office/word/2010/wordprocessingCanvas" xmlns:cx="http://schemas.microsoft.com/office/drawing/2014/chartex" xmlns:cx1="http://schemas.microsoft.com/office/drawing/2015/9/8/chartex" xmlns:cx2="http://schemas.microsoft.com/office/drawing/2015/10/21/chartex" xmlns:cx3="http://schemas.microsoft.com/office/drawing/2016/5/9/chartex" xmlns:cx4="http://schemas.microsoft.com/office/drawing/2016/5/10/chartex" xmlns:cx5="http://schemas.microsoft.com/office/drawing/2016/5/11/chartex" xmlns:cx6="http://schemas.microsoft.com/office/drawing/2016/5/12/chartex" xmlns:cx7="http://schemas.microsoft.com/office/drawing/2016/5/13/chartex" xmlns:cx8="http://schemas.microsoft.com/office/drawing/2016/5/14/chartex" xmlns:mc="http://schemas.openxmlformats.org/markup-compatibility/2006" xmlns:aink="http://schemas.microsoft.com/office/drawing/2016/ink" xmlns:am3d="http://schemas.microsoft.com/office/drawing/2017/model3d" xmlns:o="urn:schemas-microsoft-com:office:office" xmlns:r="http://schemas.openxmlformats.org/officeDocument/2006/relationships" xmlns:m="http://schemas.openxmlformats.org/officeDocument/2006/math" xmlns:v="urn:schemas-microsoft-com:vml" xmlns:wp14="http://schemas.microsoft.com/office/word/2010/wordprocessingDrawing" xmlns:wp="http://schemas.openxmlformats.org/drawingml/2006/wordprocessingDrawing" xmlns:w10="urn:schemas-microsoft-com:office:word" xmlns:w="http://schemas.openxmlformats.org/wordprocessingml/2006/main" xmlns:w14="http://schemas.microsoft.com/office/word/2010/wordml" xmlns:w15="http://schemas.microsoft.com/office/word/2012/wordml" xmlns:w16cex="http://schemas.microsoft.com/office/word/2018/wordml/cex" xmlns:w16cid="http://schemas.microsoft.com/office/word/2016/wordml/cid" xmlns:w16="http://schemas.microsoft.com/office/word/2018/wordml" xmlns:w16se="http://schemas.microsoft.com/office/word/2015/wordml/symex" xmlns:wpg="http://schemas.microsoft.com/office/word/2010/wordprocessingGroup" xmlns:wpi="http://schemas.microsoft.com/office/word/2010/wordprocessingInk" xmlns:wne="http://schemas.microsoft.com/office/word/2006/wordml" xmlns:wps="http://schemas.microsoft.com/office/word/2010/wordprocessingShape" mc:Ignorable="w14 w15 w16se w16cid w16 w16cex wp14">
-  <w:p>
-    <w:pPr>
-      <w:pStyle w:val="Header"/>
-    </w:pPr>
-  </w:p>
-</w:hdr>
-</file>
-
-<file path=word/header2.xml><?xml version="1.0" encoding="utf-8"?>
-<w:hdr xmlns:wpc="http://schemas.microsoft.com/office/word/2010/wordprocessingCanvas" xmlns:cx="http://schemas.microsoft.com/office/drawing/2014/chartex" xmlns:cx1="http://schemas.microsoft.com/office/drawing/2015/9/8/chartex" xmlns:cx2="http://schemas.microsoft.com/office/drawing/2015/10/21/chartex" xmlns:cx3="http://schemas.microsoft.com/office/drawing/2016/5/9/chartex" xmlns:cx4="http://schemas.microsoft.com/office/drawing/2016/5/10/chartex" xmlns:cx5="http://schemas.microsoft.com/office/drawing/2016/5/11/chartex" xmlns:cx6="http://schemas.microsoft.com/office/drawing/2016/5/12/chartex" xmlns:cx7="http://schemas.microsoft.com/office/drawing/2016/5/13/chartex" xmlns:cx8="http://schemas.microsoft.com/office/drawing/2016/5/14/chartex" xmlns:mc="http://schemas.openxmlformats.org/markup-compatibility/2006" xmlns:aink="http://schemas.microsoft.com/office/drawing/2016/ink" xmlns:am3d="http://schemas.microsoft.com/office/drawing/2017/model3d" xmlns:o="urn:schemas-microsoft-com:office:office" xmlns:r="http://schemas.openxmlformats.org/officeDocument/2006/relationships" xmlns:m="http://schemas.openxmlformats.org/officeDocument/2006/math" xmlns:v="urn:schemas-microsoft-com:vml" xmlns:wp14="http://schemas.microsoft.com/office/word/2010/wordprocessingDrawing" xmlns:wp="http://schemas.openxmlformats.org/drawingml/2006/wordprocessingDrawing" xmlns:w10="urn:schemas-microsoft-com:office:word" xmlns:w="http://schemas.openxmlformats.org/wordprocessingml/2006/main" xmlns:w14="http://schemas.microsoft.com/office/word/2010/wordml" xmlns:w15="http://schemas.microsoft.com/office/word/2012/wordml" xmlns:w16cex="http://schemas.microsoft.com/office/word/2018/wordml/cex" xmlns:w16cid="http://schemas.microsoft.com/office/word/2016/wordml/cid" xmlns:w16="http://schemas.microsoft.com/office/word/2018/wordml" xmlns:w16se="http://schemas.microsoft.com/office/word/2015/wordml/symex" xmlns:wpg="http://schemas.microsoft.com/office/word/2010/wordprocessingGroup" xmlns:wpi="http://schemas.microsoft.com/office/word/2010/wordprocessingInk" xmlns:wne="http://schemas.microsoft.com/office/word/2006/wordml" xmlns:wps="http://schemas.microsoft.com/office/word/2010/wordprocessingShape" mc:Ignorable="w14 w15 w16se w16cid w16 w16cex wp14">
+<w:hdr xmlns:wpc="http://schemas.microsoft.com/office/word/2010/wordprocessingCanvas" xmlns:cx="http://schemas.microsoft.com/office/drawing/2014/chartex" xmlns:cx1="http://schemas.microsoft.com/office/drawing/2015/9/8/chartex" xmlns:cx2="http://schemas.microsoft.com/office/drawing/2015/10/21/chartex" xmlns:cx3="http://schemas.microsoft.com/office/drawing/2016/5/9/chartex" xmlns:cx4="http://schemas.microsoft.com/office/drawing/2016/5/10/chartex" xmlns:cx5="http://schemas.microsoft.com/office/drawing/2016/5/11/chartex" xmlns:cx6="http://schemas.microsoft.com/office/drawing/2016/5/12/chartex" xmlns:cx7="http://schemas.microsoft.com/office/drawing/2016/5/13/chartex" xmlns:cx8="http://schemas.microsoft.com/office/drawing/2016/5/14/chartex" xmlns:mc="http://schemas.openxmlformats.org/markup-compatibility/2006" xmlns:aink="http://schemas.microsoft.com/office/drawing/2016/ink" xmlns:am3d="http://schemas.microsoft.com/office/drawing/2017/model3d" xmlns:o="urn:schemas-microsoft-com:office:office" xmlns:oel="http://schemas.microsoft.com/office/2019/extlst" xmlns:r="http://schemas.openxmlformats.org/officeDocument/2006/relationships" xmlns:m="http://schemas.openxmlformats.org/officeDocument/2006/math" xmlns:v="urn:schemas-microsoft-com:vml" xmlns:wp14="http://schemas.microsoft.com/office/word/2010/wordprocessingDrawing" xmlns:wp="http://schemas.openxmlformats.org/drawingml/2006/wordprocessingDrawing" xmlns:w10="urn:schemas-microsoft-com:office:word" xmlns:w="http://schemas.openxmlformats.org/wordprocessingml/2006/main" xmlns:w14="http://schemas.microsoft.com/office/word/2010/wordml" xmlns:w15="http://schemas.microsoft.com/office/word/2012/wordml" xmlns:w16cex="http://schemas.microsoft.com/office/word/2018/wordml/cex" xmlns:w16cid="http://schemas.microsoft.com/office/word/2016/wordml/cid" xmlns:w16="http://schemas.microsoft.com/office/word/2018/wordml" xmlns:w16du="http://schemas.microsoft.com/office/word/2023/wordml/word16du" xmlns:w16sdtdh="http://schemas.microsoft.com/office/word/2020/wordml/sdtdatahash" xmlns:w16sdtfl="http://schemas.microsoft.com/office/word/2024/wordml/sdtformatlock" xmlns:w16se="http://schemas.microsoft.com/office/word/2015/wordml/symex" xmlns:wpg="http://schemas.microsoft.com/office/word/2010/wordprocessingGroup" xmlns:wpi="http://schemas.microsoft.com/office/word/2010/wordprocessingInk" xmlns:wne="http://schemas.microsoft.com/office/word/2006/wordml" xmlns:wps="http://schemas.microsoft.com/office/word/2010/wordprocessingShape" mc:Ignorable="w14 w15 w16se w16cid w16 w16cex w16sdtdh w16sdtfl w16du wp14">
   <w:p>
     <w:pPr>
       <w:rPr>
@@ -5511,39 +5578,7 @@
         <w:b/>
         <w:sz w:val="36"/>
       </w:rPr>
-      <w:fldChar w:fldCharType="begin"/>
-    </w:r>
-    <w:r>
-      <w:rPr>
-        <w:rFonts w:ascii="Arial" w:hAnsi="Arial"/>
-        <w:b/>
-        <w:sz w:val="36"/>
-      </w:rPr>
-      <w:instrText xml:space="preserve"> DOCPROPERTY "Company"  \* MERGEFORMAT </w:instrText>
-    </w:r>
-    <w:r>
-      <w:rPr>
-        <w:rFonts w:ascii="Arial" w:hAnsi="Arial"/>
-        <w:b/>
-        <w:sz w:val="36"/>
-      </w:rPr>
-      <w:fldChar w:fldCharType="separate"/>
-    </w:r>
-    <w:r>
-      <w:rPr>
-        <w:rFonts w:ascii="Arial" w:hAnsi="Arial"/>
-        <w:b/>
-        <w:sz w:val="36"/>
-      </w:rPr>
-      <w:t>&lt;Team Name&gt;</w:t>
-    </w:r>
-    <w:r>
-      <w:rPr>
-        <w:rFonts w:ascii="Arial" w:hAnsi="Arial"/>
-        <w:b/>
-        <w:sz w:val="36"/>
-      </w:rPr>
-      <w:fldChar w:fldCharType="end"/>
+      <w:t>Code Cupid Coders</w:t>
     </w:r>
   </w:p>
   <w:p>
@@ -5565,18 +5600,8 @@
 </w:hdr>
 </file>
 
-<file path=word/header3.xml><?xml version="1.0" encoding="utf-8"?>
-<w:hdr xmlns:wpc="http://schemas.microsoft.com/office/word/2010/wordprocessingCanvas" xmlns:cx="http://schemas.microsoft.com/office/drawing/2014/chartex" xmlns:cx1="http://schemas.microsoft.com/office/drawing/2015/9/8/chartex" xmlns:cx2="http://schemas.microsoft.com/office/drawing/2015/10/21/chartex" xmlns:cx3="http://schemas.microsoft.com/office/drawing/2016/5/9/chartex" xmlns:cx4="http://schemas.microsoft.com/office/drawing/2016/5/10/chartex" xmlns:cx5="http://schemas.microsoft.com/office/drawing/2016/5/11/chartex" xmlns:cx6="http://schemas.microsoft.com/office/drawing/2016/5/12/chartex" xmlns:cx7="http://schemas.microsoft.com/office/drawing/2016/5/13/chartex" xmlns:cx8="http://schemas.microsoft.com/office/drawing/2016/5/14/chartex" xmlns:mc="http://schemas.openxmlformats.org/markup-compatibility/2006" xmlns:aink="http://schemas.microsoft.com/office/drawing/2016/ink" xmlns:am3d="http://schemas.microsoft.com/office/drawing/2017/model3d" xmlns:o="urn:schemas-microsoft-com:office:office" xmlns:r="http://schemas.openxmlformats.org/officeDocument/2006/relationships" xmlns:m="http://schemas.openxmlformats.org/officeDocument/2006/math" xmlns:v="urn:schemas-microsoft-com:vml" xmlns:wp14="http://schemas.microsoft.com/office/word/2010/wordprocessingDrawing" xmlns:wp="http://schemas.openxmlformats.org/drawingml/2006/wordprocessingDrawing" xmlns:w10="urn:schemas-microsoft-com:office:word" xmlns:w="http://schemas.openxmlformats.org/wordprocessingml/2006/main" xmlns:w14="http://schemas.microsoft.com/office/word/2010/wordml" xmlns:w15="http://schemas.microsoft.com/office/word/2012/wordml" xmlns:w16cex="http://schemas.microsoft.com/office/word/2018/wordml/cex" xmlns:w16cid="http://schemas.microsoft.com/office/word/2016/wordml/cid" xmlns:w16="http://schemas.microsoft.com/office/word/2018/wordml" xmlns:w16se="http://schemas.microsoft.com/office/word/2015/wordml/symex" xmlns:wpg="http://schemas.microsoft.com/office/word/2010/wordprocessingGroup" xmlns:wpi="http://schemas.microsoft.com/office/word/2010/wordprocessingInk" xmlns:wne="http://schemas.microsoft.com/office/word/2006/wordml" xmlns:wps="http://schemas.microsoft.com/office/word/2010/wordprocessingShape" mc:Ignorable="w14 w15 w16se w16cid w16 w16cex wp14">
-  <w:p>
-    <w:pPr>
-      <w:pStyle w:val="Header"/>
-    </w:pPr>
-  </w:p>
-</w:hdr>
-</file>
-
-<file path=word/header4.xml><?xml version="1.0" encoding="utf-8"?>
-<w:hdr xmlns:wpc="http://schemas.microsoft.com/office/word/2010/wordprocessingCanvas" xmlns:cx="http://schemas.microsoft.com/office/drawing/2014/chartex" xmlns:cx1="http://schemas.microsoft.com/office/drawing/2015/9/8/chartex" xmlns:cx2="http://schemas.microsoft.com/office/drawing/2015/10/21/chartex" xmlns:cx3="http://schemas.microsoft.com/office/drawing/2016/5/9/chartex" xmlns:cx4="http://schemas.microsoft.com/office/drawing/2016/5/10/chartex" xmlns:cx5="http://schemas.microsoft.com/office/drawing/2016/5/11/chartex" xmlns:cx6="http://schemas.microsoft.com/office/drawing/2016/5/12/chartex" xmlns:cx7="http://schemas.microsoft.com/office/drawing/2016/5/13/chartex" xmlns:cx8="http://schemas.microsoft.com/office/drawing/2016/5/14/chartex" xmlns:mc="http://schemas.openxmlformats.org/markup-compatibility/2006" xmlns:aink="http://schemas.microsoft.com/office/drawing/2016/ink" xmlns:am3d="http://schemas.microsoft.com/office/drawing/2017/model3d" xmlns:o="urn:schemas-microsoft-com:office:office" xmlns:r="http://schemas.openxmlformats.org/officeDocument/2006/relationships" xmlns:m="http://schemas.openxmlformats.org/officeDocument/2006/math" xmlns:v="urn:schemas-microsoft-com:vml" xmlns:wp14="http://schemas.microsoft.com/office/word/2010/wordprocessingDrawing" xmlns:wp="http://schemas.openxmlformats.org/drawingml/2006/wordprocessingDrawing" xmlns:w10="urn:schemas-microsoft-com:office:word" xmlns:w="http://schemas.openxmlformats.org/wordprocessingml/2006/main" xmlns:w14="http://schemas.microsoft.com/office/word/2010/wordml" xmlns:w15="http://schemas.microsoft.com/office/word/2012/wordml" xmlns:w16cex="http://schemas.microsoft.com/office/word/2018/wordml/cex" xmlns:w16cid="http://schemas.microsoft.com/office/word/2016/wordml/cid" xmlns:w16="http://schemas.microsoft.com/office/word/2018/wordml" xmlns:w16se="http://schemas.microsoft.com/office/word/2015/wordml/symex" xmlns:wpg="http://schemas.microsoft.com/office/word/2010/wordprocessingGroup" xmlns:wpi="http://schemas.microsoft.com/office/word/2010/wordprocessingInk" xmlns:wne="http://schemas.microsoft.com/office/word/2006/wordml" xmlns:wps="http://schemas.microsoft.com/office/word/2010/wordprocessingShape" mc:Ignorable="w14 w15 w16se w16cid w16 w16cex wp14">
+<file path=word/header2.xml><?xml version="1.0" encoding="utf-8"?>
+<w:hdr xmlns:wpc="http://schemas.microsoft.com/office/word/2010/wordprocessingCanvas" xmlns:cx="http://schemas.microsoft.com/office/drawing/2014/chartex" xmlns:cx1="http://schemas.microsoft.com/office/drawing/2015/9/8/chartex" xmlns:cx2="http://schemas.microsoft.com/office/drawing/2015/10/21/chartex" xmlns:cx3="http://schemas.microsoft.com/office/drawing/2016/5/9/chartex" xmlns:cx4="http://schemas.microsoft.com/office/drawing/2016/5/10/chartex" xmlns:cx5="http://schemas.microsoft.com/office/drawing/2016/5/11/chartex" xmlns:cx6="http://schemas.microsoft.com/office/drawing/2016/5/12/chartex" xmlns:cx7="http://schemas.microsoft.com/office/drawing/2016/5/13/chartex" xmlns:cx8="http://schemas.microsoft.com/office/drawing/2016/5/14/chartex" xmlns:mc="http://schemas.openxmlformats.org/markup-compatibility/2006" xmlns:aink="http://schemas.microsoft.com/office/drawing/2016/ink" xmlns:am3d="http://schemas.microsoft.com/office/drawing/2017/model3d" xmlns:o="urn:schemas-microsoft-com:office:office" xmlns:oel="http://schemas.microsoft.com/office/2019/extlst" xmlns:r="http://schemas.openxmlformats.org/officeDocument/2006/relationships" xmlns:m="http://schemas.openxmlformats.org/officeDocument/2006/math" xmlns:v="urn:schemas-microsoft-com:vml" xmlns:wp14="http://schemas.microsoft.com/office/word/2010/wordprocessingDrawing" xmlns:wp="http://schemas.openxmlformats.org/drawingml/2006/wordprocessingDrawing" xmlns:w10="urn:schemas-microsoft-com:office:word" xmlns:w="http://schemas.openxmlformats.org/wordprocessingml/2006/main" xmlns:w14="http://schemas.microsoft.com/office/word/2010/wordml" xmlns:w15="http://schemas.microsoft.com/office/word/2012/wordml" xmlns:w16cex="http://schemas.microsoft.com/office/word/2018/wordml/cex" xmlns:w16cid="http://schemas.microsoft.com/office/word/2016/wordml/cid" xmlns:w16="http://schemas.microsoft.com/office/word/2018/wordml" xmlns:w16du="http://schemas.microsoft.com/office/word/2023/wordml/word16du" xmlns:w16sdtdh="http://schemas.microsoft.com/office/word/2020/wordml/sdtdatahash" xmlns:w16sdtfl="http://schemas.microsoft.com/office/word/2024/wordml/sdtformatlock" xmlns:w16se="http://schemas.microsoft.com/office/word/2015/wordml/symex" xmlns:wpg="http://schemas.microsoft.com/office/word/2010/wordprocessingGroup" xmlns:wpi="http://schemas.microsoft.com/office/word/2010/wordprocessingInk" xmlns:wne="http://schemas.microsoft.com/office/word/2006/wordml" xmlns:wps="http://schemas.microsoft.com/office/word/2010/wordprocessingShape" mc:Ignorable="w14 w15 w16se w16cid w16 w16cex w16sdtdh w16sdtfl w16du wp14">
   <w:tbl>
     <w:tblPr>
       <w:tblW w:w="9558" w:type="dxa"/>
@@ -5620,19 +5645,16 @@
             <w:fldChar w:fldCharType="separate"/>
           </w:r>
           <w:r>
-            <w:t>&lt;</w:t>
-          </w:r>
-          <w:r>
-            <w:t xml:space="preserve">Team </w:t>
-          </w:r>
-          <w:r>
-            <w:t>Name&gt;</w:t>
+            <w:t>Code Cupid Coders</w:t>
           </w:r>
           <w:r>
             <w:rPr>
               <w:b/>
             </w:rPr>
             <w:fldChar w:fldCharType="end"/>
+          </w:r>
+          <w:r>
+            <w:t xml:space="preserve"> </w:t>
           </w:r>
         </w:p>
       </w:tc>
@@ -5667,7 +5689,7 @@
         </w:tcPr>
         <w:p>
           <w:r>
-            <w:t>&lt;Product Name&gt;</w:t>
+            <w:t>Code Cupid</w:t>
           </w:r>
         </w:p>
       </w:tc>
@@ -5677,7 +5699,15 @@
         </w:tcPr>
         <w:p>
           <w:r>
-            <w:t xml:space="preserve">  Date:  &lt;dd/mmm/yy&gt;</w:t>
+            <w:t xml:space="preserve">  Date:  &lt;dd/mmm/</w:t>
+          </w:r>
+          <w:proofErr w:type="spellStart"/>
+          <w:r>
+            <w:t>yy</w:t>
+          </w:r>
+          <w:proofErr w:type="spellEnd"/>
+          <w:r>
+            <w:t>&gt;</w:t>
           </w:r>
         </w:p>
       </w:tc>
@@ -5692,7 +5722,7 @@
 </file>
 
 <file path=word/numbering.xml><?xml version="1.0" encoding="utf-8"?>
-<w:numbering xmlns:wpc="http://schemas.microsoft.com/office/word/2010/wordprocessingCanvas" xmlns:cx="http://schemas.microsoft.com/office/drawing/2014/chartex" xmlns:cx1="http://schemas.microsoft.com/office/drawing/2015/9/8/chartex" xmlns:cx2="http://schemas.microsoft.com/office/drawing/2015/10/21/chartex" xmlns:cx3="http://schemas.microsoft.com/office/drawing/2016/5/9/chartex" xmlns:cx4="http://schemas.microsoft.com/office/drawing/2016/5/10/chartex" xmlns:cx5="http://schemas.microsoft.com/office/drawing/2016/5/11/chartex" xmlns:cx6="http://schemas.microsoft.com/office/drawing/2016/5/12/chartex" xmlns:cx7="http://schemas.microsoft.com/office/drawing/2016/5/13/chartex" xmlns:cx8="http://schemas.microsoft.com/office/drawing/2016/5/14/chartex" xmlns:mc="http://schemas.openxmlformats.org/markup-compatibility/2006" xmlns:aink="http://schemas.microsoft.com/office/drawing/2016/ink" xmlns:am3d="http://schemas.microsoft.com/office/drawing/2017/model3d" xmlns:o="urn:schemas-microsoft-com:office:office" xmlns:r="http://schemas.openxmlformats.org/officeDocument/2006/relationships" xmlns:m="http://schemas.openxmlformats.org/officeDocument/2006/math" xmlns:v="urn:schemas-microsoft-com:vml" xmlns:wp14="http://schemas.microsoft.com/office/word/2010/wordprocessingDrawing" xmlns:wp="http://schemas.openxmlformats.org/drawingml/2006/wordprocessingDrawing" xmlns:w10="urn:schemas-microsoft-com:office:word" xmlns:w="http://schemas.openxmlformats.org/wordprocessingml/2006/main" xmlns:w14="http://schemas.microsoft.com/office/word/2010/wordml" xmlns:w15="http://schemas.microsoft.com/office/word/2012/wordml" xmlns:w16cex="http://schemas.microsoft.com/office/word/2018/wordml/cex" xmlns:w16cid="http://schemas.microsoft.com/office/word/2016/wordml/cid" xmlns:w16="http://schemas.microsoft.com/office/word/2018/wordml" xmlns:w16se="http://schemas.microsoft.com/office/word/2015/wordml/symex" xmlns:wpg="http://schemas.microsoft.com/office/word/2010/wordprocessingGroup" xmlns:wpi="http://schemas.microsoft.com/office/word/2010/wordprocessingInk" xmlns:wne="http://schemas.microsoft.com/office/word/2006/wordml" xmlns:wps="http://schemas.microsoft.com/office/word/2010/wordprocessingShape" mc:Ignorable="w14 w15 w16se w16cid w16 w16cex wp14">
+<w:numbering xmlns:wpc="http://schemas.microsoft.com/office/word/2010/wordprocessingCanvas" xmlns:cx="http://schemas.microsoft.com/office/drawing/2014/chartex" xmlns:cx1="http://schemas.microsoft.com/office/drawing/2015/9/8/chartex" xmlns:cx2="http://schemas.microsoft.com/office/drawing/2015/10/21/chartex" xmlns:cx3="http://schemas.microsoft.com/office/drawing/2016/5/9/chartex" xmlns:cx4="http://schemas.microsoft.com/office/drawing/2016/5/10/chartex" xmlns:cx5="http://schemas.microsoft.com/office/drawing/2016/5/11/chartex" xmlns:cx6="http://schemas.microsoft.com/office/drawing/2016/5/12/chartex" xmlns:cx7="http://schemas.microsoft.com/office/drawing/2016/5/13/chartex" xmlns:cx8="http://schemas.microsoft.com/office/drawing/2016/5/14/chartex" xmlns:mc="http://schemas.openxmlformats.org/markup-compatibility/2006" xmlns:aink="http://schemas.microsoft.com/office/drawing/2016/ink" xmlns:am3d="http://schemas.microsoft.com/office/drawing/2017/model3d" xmlns:o="urn:schemas-microsoft-com:office:office" xmlns:oel="http://schemas.microsoft.com/office/2019/extlst" xmlns:r="http://schemas.openxmlformats.org/officeDocument/2006/relationships" xmlns:m="http://schemas.openxmlformats.org/officeDocument/2006/math" xmlns:v="urn:schemas-microsoft-com:vml" xmlns:wp14="http://schemas.microsoft.com/office/word/2010/wordprocessingDrawing" xmlns:wp="http://schemas.openxmlformats.org/drawingml/2006/wordprocessingDrawing" xmlns:w10="urn:schemas-microsoft-com:office:word" xmlns:w="http://schemas.openxmlformats.org/wordprocessingml/2006/main" xmlns:w14="http://schemas.microsoft.com/office/word/2010/wordml" xmlns:w15="http://schemas.microsoft.com/office/word/2012/wordml" xmlns:w16cex="http://schemas.microsoft.com/office/word/2018/wordml/cex" xmlns:w16cid="http://schemas.microsoft.com/office/word/2016/wordml/cid" xmlns:w16="http://schemas.microsoft.com/office/word/2018/wordml" xmlns:w16du="http://schemas.microsoft.com/office/word/2023/wordml/word16du" xmlns:w16sdtdh="http://schemas.microsoft.com/office/word/2020/wordml/sdtdatahash" xmlns:w16sdtfl="http://schemas.microsoft.com/office/word/2024/wordml/sdtformatlock" xmlns:w16se="http://schemas.microsoft.com/office/word/2015/wordml/symex" xmlns:wpg="http://schemas.microsoft.com/office/word/2010/wordprocessingGroup" xmlns:wpi="http://schemas.microsoft.com/office/word/2010/wordprocessingInk" xmlns:wne="http://schemas.microsoft.com/office/word/2006/wordml" xmlns:wps="http://schemas.microsoft.com/office/word/2010/wordprocessingShape" mc:Ignorable="w14 w15 w16se w16cid w16 w16cex w16sdtdh w16sdtfl w16du wp14">
   <w:abstractNum w:abstractNumId="0" w15:restartNumberingAfterBreak="0">
     <w:nsid w:val="FFFFFFFB"/>
     <w:multiLevelType w:val="multilevel"/>
@@ -5941,6 +5971,155 @@
     </w:lvl>
   </w:abstractNum>
   <w:abstractNum w:abstractNumId="10" w15:restartNumberingAfterBreak="0">
+    <w:nsid w:val="2B4A7285"/>
+    <w:multiLevelType w:val="multilevel"/>
+    <w:tmpl w:val="777C3602"/>
+    <w:lvl w:ilvl="0">
+      <w:start w:val="1"/>
+      <w:numFmt w:val="bullet"/>
+      <w:lvlText w:val=""/>
+      <w:lvlJc w:val="left"/>
+      <w:pPr>
+        <w:tabs>
+          <w:tab w:val="num" w:pos="720"/>
+        </w:tabs>
+        <w:ind w:left="720" w:hanging="360"/>
+      </w:pPr>
+      <w:rPr>
+        <w:rFonts w:ascii="Symbol" w:hAnsi="Symbol" w:hint="default"/>
+        <w:sz w:val="20"/>
+      </w:rPr>
+    </w:lvl>
+    <w:lvl w:ilvl="1" w:tentative="1">
+      <w:start w:val="1"/>
+      <w:numFmt w:val="bullet"/>
+      <w:lvlText w:val=""/>
+      <w:lvlJc w:val="left"/>
+      <w:pPr>
+        <w:tabs>
+          <w:tab w:val="num" w:pos="1440"/>
+        </w:tabs>
+        <w:ind w:left="1440" w:hanging="360"/>
+      </w:pPr>
+      <w:rPr>
+        <w:rFonts w:ascii="Symbol" w:hAnsi="Symbol" w:hint="default"/>
+        <w:sz w:val="20"/>
+      </w:rPr>
+    </w:lvl>
+    <w:lvl w:ilvl="2" w:tentative="1">
+      <w:start w:val="1"/>
+      <w:numFmt w:val="bullet"/>
+      <w:lvlText w:val=""/>
+      <w:lvlJc w:val="left"/>
+      <w:pPr>
+        <w:tabs>
+          <w:tab w:val="num" w:pos="2160"/>
+        </w:tabs>
+        <w:ind w:left="2160" w:hanging="360"/>
+      </w:pPr>
+      <w:rPr>
+        <w:rFonts w:ascii="Symbol" w:hAnsi="Symbol" w:hint="default"/>
+        <w:sz w:val="20"/>
+      </w:rPr>
+    </w:lvl>
+    <w:lvl w:ilvl="3" w:tentative="1">
+      <w:start w:val="1"/>
+      <w:numFmt w:val="bullet"/>
+      <w:lvlText w:val=""/>
+      <w:lvlJc w:val="left"/>
+      <w:pPr>
+        <w:tabs>
+          <w:tab w:val="num" w:pos="2880"/>
+        </w:tabs>
+        <w:ind w:left="2880" w:hanging="360"/>
+      </w:pPr>
+      <w:rPr>
+        <w:rFonts w:ascii="Symbol" w:hAnsi="Symbol" w:hint="default"/>
+        <w:sz w:val="20"/>
+      </w:rPr>
+    </w:lvl>
+    <w:lvl w:ilvl="4" w:tentative="1">
+      <w:start w:val="1"/>
+      <w:numFmt w:val="bullet"/>
+      <w:lvlText w:val=""/>
+      <w:lvlJc w:val="left"/>
+      <w:pPr>
+        <w:tabs>
+          <w:tab w:val="num" w:pos="3600"/>
+        </w:tabs>
+        <w:ind w:left="3600" w:hanging="360"/>
+      </w:pPr>
+      <w:rPr>
+        <w:rFonts w:ascii="Symbol" w:hAnsi="Symbol" w:hint="default"/>
+        <w:sz w:val="20"/>
+      </w:rPr>
+    </w:lvl>
+    <w:lvl w:ilvl="5" w:tentative="1">
+      <w:start w:val="1"/>
+      <w:numFmt w:val="bullet"/>
+      <w:lvlText w:val=""/>
+      <w:lvlJc w:val="left"/>
+      <w:pPr>
+        <w:tabs>
+          <w:tab w:val="num" w:pos="4320"/>
+        </w:tabs>
+        <w:ind w:left="4320" w:hanging="360"/>
+      </w:pPr>
+      <w:rPr>
+        <w:rFonts w:ascii="Symbol" w:hAnsi="Symbol" w:hint="default"/>
+        <w:sz w:val="20"/>
+      </w:rPr>
+    </w:lvl>
+    <w:lvl w:ilvl="6" w:tentative="1">
+      <w:start w:val="1"/>
+      <w:numFmt w:val="bullet"/>
+      <w:lvlText w:val=""/>
+      <w:lvlJc w:val="left"/>
+      <w:pPr>
+        <w:tabs>
+          <w:tab w:val="num" w:pos="5040"/>
+        </w:tabs>
+        <w:ind w:left="5040" w:hanging="360"/>
+      </w:pPr>
+      <w:rPr>
+        <w:rFonts w:ascii="Symbol" w:hAnsi="Symbol" w:hint="default"/>
+        <w:sz w:val="20"/>
+      </w:rPr>
+    </w:lvl>
+    <w:lvl w:ilvl="7" w:tentative="1">
+      <w:start w:val="1"/>
+      <w:numFmt w:val="bullet"/>
+      <w:lvlText w:val=""/>
+      <w:lvlJc w:val="left"/>
+      <w:pPr>
+        <w:tabs>
+          <w:tab w:val="num" w:pos="5760"/>
+        </w:tabs>
+        <w:ind w:left="5760" w:hanging="360"/>
+      </w:pPr>
+      <w:rPr>
+        <w:rFonts w:ascii="Symbol" w:hAnsi="Symbol" w:hint="default"/>
+        <w:sz w:val="20"/>
+      </w:rPr>
+    </w:lvl>
+    <w:lvl w:ilvl="8" w:tentative="1">
+      <w:start w:val="1"/>
+      <w:numFmt w:val="bullet"/>
+      <w:lvlText w:val=""/>
+      <w:lvlJc w:val="left"/>
+      <w:pPr>
+        <w:tabs>
+          <w:tab w:val="num" w:pos="6480"/>
+        </w:tabs>
+        <w:ind w:left="6480" w:hanging="360"/>
+      </w:pPr>
+      <w:rPr>
+        <w:rFonts w:ascii="Symbol" w:hAnsi="Symbol" w:hint="default"/>
+        <w:sz w:val="20"/>
+      </w:rPr>
+    </w:lvl>
+  </w:abstractNum>
+  <w:abstractNum w:abstractNumId="11" w15:restartNumberingAfterBreak="0">
     <w:nsid w:val="2D4B634E"/>
     <w:multiLevelType w:val="singleLevel"/>
     <w:tmpl w:val="04090001"/>
@@ -5960,7 +6139,7 @@
       </w:rPr>
     </w:lvl>
   </w:abstractNum>
-  <w:abstractNum w:abstractNumId="11" w15:restartNumberingAfterBreak="0">
+  <w:abstractNum w:abstractNumId="12" w15:restartNumberingAfterBreak="0">
     <w:nsid w:val="31DD2C45"/>
     <w:multiLevelType w:val="singleLevel"/>
     <w:tmpl w:val="04090001"/>
@@ -5980,7 +6159,7 @@
       </w:rPr>
     </w:lvl>
   </w:abstractNum>
-  <w:abstractNum w:abstractNumId="12" w15:restartNumberingAfterBreak="0">
+  <w:abstractNum w:abstractNumId="13" w15:restartNumberingAfterBreak="0">
     <w:nsid w:val="32982B51"/>
     <w:multiLevelType w:val="singleLevel"/>
     <w:tmpl w:val="04090001"/>
@@ -6000,7 +6179,7 @@
       </w:rPr>
     </w:lvl>
   </w:abstractNum>
-  <w:abstractNum w:abstractNumId="13" w15:restartNumberingAfterBreak="0">
+  <w:abstractNum w:abstractNumId="14" w15:restartNumberingAfterBreak="0">
     <w:nsid w:val="3375481C"/>
     <w:multiLevelType w:val="singleLevel"/>
     <w:tmpl w:val="E6747DA6"/>
@@ -6020,7 +6199,7 @@
       </w:rPr>
     </w:lvl>
   </w:abstractNum>
-  <w:abstractNum w:abstractNumId="14" w15:restartNumberingAfterBreak="0">
+  <w:abstractNum w:abstractNumId="15" w15:restartNumberingAfterBreak="0">
     <w:nsid w:val="369D5471"/>
     <w:multiLevelType w:val="singleLevel"/>
     <w:tmpl w:val="04090001"/>
@@ -6040,7 +6219,7 @@
       </w:rPr>
     </w:lvl>
   </w:abstractNum>
-  <w:abstractNum w:abstractNumId="15" w15:restartNumberingAfterBreak="0">
+  <w:abstractNum w:abstractNumId="16" w15:restartNumberingAfterBreak="0">
     <w:nsid w:val="398C0069"/>
     <w:multiLevelType w:val="hybridMultilevel"/>
     <w:tmpl w:val="28E8AA08"/>
@@ -6179,7 +6358,7 @@
       </w:rPr>
     </w:lvl>
   </w:abstractNum>
-  <w:abstractNum w:abstractNumId="16" w15:restartNumberingAfterBreak="0">
+  <w:abstractNum w:abstractNumId="17" w15:restartNumberingAfterBreak="0">
     <w:nsid w:val="3FB71469"/>
     <w:multiLevelType w:val="multilevel"/>
     <w:tmpl w:val="4F862630"/>
@@ -6293,7 +6472,7 @@
       </w:pPr>
     </w:lvl>
   </w:abstractNum>
-  <w:abstractNum w:abstractNumId="17" w15:restartNumberingAfterBreak="0">
+  <w:abstractNum w:abstractNumId="18" w15:restartNumberingAfterBreak="0">
     <w:nsid w:val="42B97F7B"/>
     <w:multiLevelType w:val="singleLevel"/>
     <w:tmpl w:val="04090001"/>
@@ -6313,7 +6492,96 @@
       </w:rPr>
     </w:lvl>
   </w:abstractNum>
-  <w:abstractNum w:abstractNumId="18" w15:restartNumberingAfterBreak="0">
+  <w:abstractNum w:abstractNumId="19" w15:restartNumberingAfterBreak="0">
+    <w:nsid w:val="43B35E55"/>
+    <w:multiLevelType w:val="hybridMultilevel"/>
+    <w:tmpl w:val="904E7D56"/>
+    <w:lvl w:ilvl="0" w:tplc="FFFFFFFF">
+      <w:start w:val="1"/>
+      <w:numFmt w:val="decimal"/>
+      <w:lvlText w:val="%1."/>
+      <w:lvlJc w:val="left"/>
+      <w:pPr>
+        <w:ind w:left="720" w:hanging="360"/>
+      </w:pPr>
+      <w:rPr>
+        <w:rFonts w:hint="default"/>
+      </w:rPr>
+    </w:lvl>
+    <w:lvl w:ilvl="1" w:tplc="FFFFFFFF" w:tentative="1">
+      <w:start w:val="1"/>
+      <w:numFmt w:val="lowerLetter"/>
+      <w:lvlText w:val="%2."/>
+      <w:lvlJc w:val="left"/>
+      <w:pPr>
+        <w:ind w:left="1440" w:hanging="360"/>
+      </w:pPr>
+    </w:lvl>
+    <w:lvl w:ilvl="2" w:tplc="FFFFFFFF" w:tentative="1">
+      <w:start w:val="1"/>
+      <w:numFmt w:val="lowerRoman"/>
+      <w:lvlText w:val="%3."/>
+      <w:lvlJc w:val="right"/>
+      <w:pPr>
+        <w:ind w:left="2160" w:hanging="180"/>
+      </w:pPr>
+    </w:lvl>
+    <w:lvl w:ilvl="3" w:tplc="FFFFFFFF" w:tentative="1">
+      <w:start w:val="1"/>
+      <w:numFmt w:val="decimal"/>
+      <w:lvlText w:val="%4."/>
+      <w:lvlJc w:val="left"/>
+      <w:pPr>
+        <w:ind w:left="2880" w:hanging="360"/>
+      </w:pPr>
+    </w:lvl>
+    <w:lvl w:ilvl="4" w:tplc="FFFFFFFF" w:tentative="1">
+      <w:start w:val="1"/>
+      <w:numFmt w:val="lowerLetter"/>
+      <w:lvlText w:val="%5."/>
+      <w:lvlJc w:val="left"/>
+      <w:pPr>
+        <w:ind w:left="3600" w:hanging="360"/>
+      </w:pPr>
+    </w:lvl>
+    <w:lvl w:ilvl="5" w:tplc="FFFFFFFF" w:tentative="1">
+      <w:start w:val="1"/>
+      <w:numFmt w:val="lowerRoman"/>
+      <w:lvlText w:val="%6."/>
+      <w:lvlJc w:val="right"/>
+      <w:pPr>
+        <w:ind w:left="4320" w:hanging="180"/>
+      </w:pPr>
+    </w:lvl>
+    <w:lvl w:ilvl="6" w:tplc="FFFFFFFF" w:tentative="1">
+      <w:start w:val="1"/>
+      <w:numFmt w:val="decimal"/>
+      <w:lvlText w:val="%7."/>
+      <w:lvlJc w:val="left"/>
+      <w:pPr>
+        <w:ind w:left="5040" w:hanging="360"/>
+      </w:pPr>
+    </w:lvl>
+    <w:lvl w:ilvl="7" w:tplc="FFFFFFFF" w:tentative="1">
+      <w:start w:val="1"/>
+      <w:numFmt w:val="lowerLetter"/>
+      <w:lvlText w:val="%8."/>
+      <w:lvlJc w:val="left"/>
+      <w:pPr>
+        <w:ind w:left="5760" w:hanging="360"/>
+      </w:pPr>
+    </w:lvl>
+    <w:lvl w:ilvl="8" w:tplc="FFFFFFFF" w:tentative="1">
+      <w:start w:val="1"/>
+      <w:numFmt w:val="lowerRoman"/>
+      <w:lvlText w:val="%9."/>
+      <w:lvlJc w:val="right"/>
+      <w:pPr>
+        <w:ind w:left="6480" w:hanging="180"/>
+      </w:pPr>
+    </w:lvl>
+  </w:abstractNum>
+  <w:abstractNum w:abstractNumId="20" w15:restartNumberingAfterBreak="0">
     <w:nsid w:val="49E170D0"/>
     <w:multiLevelType w:val="singleLevel"/>
     <w:tmpl w:val="04090001"/>
@@ -6333,7 +6601,7 @@
       </w:rPr>
     </w:lvl>
   </w:abstractNum>
-  <w:abstractNum w:abstractNumId="19" w15:restartNumberingAfterBreak="0">
+  <w:abstractNum w:abstractNumId="21" w15:restartNumberingAfterBreak="0">
     <w:nsid w:val="4A0F54F4"/>
     <w:multiLevelType w:val="hybridMultilevel"/>
     <w:tmpl w:val="143A4384"/>
@@ -6445,7 +6713,7 @@
       </w:rPr>
     </w:lvl>
   </w:abstractNum>
-  <w:abstractNum w:abstractNumId="20" w15:restartNumberingAfterBreak="0">
+  <w:abstractNum w:abstractNumId="22" w15:restartNumberingAfterBreak="0">
     <w:nsid w:val="4F64732B"/>
     <w:multiLevelType w:val="singleLevel"/>
     <w:tmpl w:val="04090001"/>
@@ -6465,7 +6733,7 @@
       </w:rPr>
     </w:lvl>
   </w:abstractNum>
-  <w:abstractNum w:abstractNumId="21" w15:restartNumberingAfterBreak="0">
+  <w:abstractNum w:abstractNumId="23" w15:restartNumberingAfterBreak="0">
     <w:nsid w:val="52DF734E"/>
     <w:multiLevelType w:val="singleLevel"/>
     <w:tmpl w:val="04090001"/>
@@ -6485,7 +6753,7 @@
       </w:rPr>
     </w:lvl>
   </w:abstractNum>
-  <w:abstractNum w:abstractNumId="22" w15:restartNumberingAfterBreak="0">
+  <w:abstractNum w:abstractNumId="24" w15:restartNumberingAfterBreak="0">
     <w:nsid w:val="567E71CD"/>
     <w:multiLevelType w:val="hybridMultilevel"/>
     <w:tmpl w:val="4278688E"/>
@@ -6598,7 +6866,7 @@
       </w:rPr>
     </w:lvl>
   </w:abstractNum>
-  <w:abstractNum w:abstractNumId="23" w15:restartNumberingAfterBreak="0">
+  <w:abstractNum w:abstractNumId="25" w15:restartNumberingAfterBreak="0">
     <w:nsid w:val="59F314B7"/>
     <w:multiLevelType w:val="singleLevel"/>
     <w:tmpl w:val="04090001"/>
@@ -6618,7 +6886,121 @@
       </w:rPr>
     </w:lvl>
   </w:abstractNum>
-  <w:abstractNum w:abstractNumId="24" w15:restartNumberingAfterBreak="0">
+  <w:abstractNum w:abstractNumId="26" w15:restartNumberingAfterBreak="0">
+    <w:nsid w:val="5DAD7731"/>
+    <w:multiLevelType w:val="hybridMultilevel"/>
+    <w:tmpl w:val="8078E19A"/>
+    <w:lvl w:ilvl="0" w:tplc="75BE9E9E">
+      <w:numFmt w:val="bullet"/>
+      <w:lvlText w:val="-"/>
+      <w:lvlJc w:val="left"/>
+      <w:pPr>
+        <w:ind w:left="720" w:hanging="360"/>
+      </w:pPr>
+      <w:rPr>
+        <w:rFonts w:ascii="Times New Roman" w:eastAsia="Times New Roman" w:hAnsi="Times New Roman" w:cs="Times New Roman" w:hint="default"/>
+        <w:i/>
+        <w:color w:val="0000FF"/>
+      </w:rPr>
+    </w:lvl>
+    <w:lvl w:ilvl="1" w:tplc="10090003" w:tentative="1">
+      <w:start w:val="1"/>
+      <w:numFmt w:val="bullet"/>
+      <w:lvlText w:val="o"/>
+      <w:lvlJc w:val="left"/>
+      <w:pPr>
+        <w:ind w:left="1440" w:hanging="360"/>
+      </w:pPr>
+      <w:rPr>
+        <w:rFonts w:ascii="Courier New" w:hAnsi="Courier New" w:cs="Courier New" w:hint="default"/>
+      </w:rPr>
+    </w:lvl>
+    <w:lvl w:ilvl="2" w:tplc="10090005" w:tentative="1">
+      <w:start w:val="1"/>
+      <w:numFmt w:val="bullet"/>
+      <w:lvlText w:val=""/>
+      <w:lvlJc w:val="left"/>
+      <w:pPr>
+        <w:ind w:left="2160" w:hanging="360"/>
+      </w:pPr>
+      <w:rPr>
+        <w:rFonts w:ascii="Wingdings" w:hAnsi="Wingdings" w:hint="default"/>
+      </w:rPr>
+    </w:lvl>
+    <w:lvl w:ilvl="3" w:tplc="10090001" w:tentative="1">
+      <w:start w:val="1"/>
+      <w:numFmt w:val="bullet"/>
+      <w:lvlText w:val=""/>
+      <w:lvlJc w:val="left"/>
+      <w:pPr>
+        <w:ind w:left="2880" w:hanging="360"/>
+      </w:pPr>
+      <w:rPr>
+        <w:rFonts w:ascii="Symbol" w:hAnsi="Symbol" w:hint="default"/>
+      </w:rPr>
+    </w:lvl>
+    <w:lvl w:ilvl="4" w:tplc="10090003" w:tentative="1">
+      <w:start w:val="1"/>
+      <w:numFmt w:val="bullet"/>
+      <w:lvlText w:val="o"/>
+      <w:lvlJc w:val="left"/>
+      <w:pPr>
+        <w:ind w:left="3600" w:hanging="360"/>
+      </w:pPr>
+      <w:rPr>
+        <w:rFonts w:ascii="Courier New" w:hAnsi="Courier New" w:cs="Courier New" w:hint="default"/>
+      </w:rPr>
+    </w:lvl>
+    <w:lvl w:ilvl="5" w:tplc="10090005" w:tentative="1">
+      <w:start w:val="1"/>
+      <w:numFmt w:val="bullet"/>
+      <w:lvlText w:val=""/>
+      <w:lvlJc w:val="left"/>
+      <w:pPr>
+        <w:ind w:left="4320" w:hanging="360"/>
+      </w:pPr>
+      <w:rPr>
+        <w:rFonts w:ascii="Wingdings" w:hAnsi="Wingdings" w:hint="default"/>
+      </w:rPr>
+    </w:lvl>
+    <w:lvl w:ilvl="6" w:tplc="10090001" w:tentative="1">
+      <w:start w:val="1"/>
+      <w:numFmt w:val="bullet"/>
+      <w:lvlText w:val=""/>
+      <w:lvlJc w:val="left"/>
+      <w:pPr>
+        <w:ind w:left="5040" w:hanging="360"/>
+      </w:pPr>
+      <w:rPr>
+        <w:rFonts w:ascii="Symbol" w:hAnsi="Symbol" w:hint="default"/>
+      </w:rPr>
+    </w:lvl>
+    <w:lvl w:ilvl="7" w:tplc="10090003" w:tentative="1">
+      <w:start w:val="1"/>
+      <w:numFmt w:val="bullet"/>
+      <w:lvlText w:val="o"/>
+      <w:lvlJc w:val="left"/>
+      <w:pPr>
+        <w:ind w:left="5760" w:hanging="360"/>
+      </w:pPr>
+      <w:rPr>
+        <w:rFonts w:ascii="Courier New" w:hAnsi="Courier New" w:cs="Courier New" w:hint="default"/>
+      </w:rPr>
+    </w:lvl>
+    <w:lvl w:ilvl="8" w:tplc="10090005" w:tentative="1">
+      <w:start w:val="1"/>
+      <w:numFmt w:val="bullet"/>
+      <w:lvlText w:val=""/>
+      <w:lvlJc w:val="left"/>
+      <w:pPr>
+        <w:ind w:left="6480" w:hanging="360"/>
+      </w:pPr>
+      <w:rPr>
+        <w:rFonts w:ascii="Wingdings" w:hAnsi="Wingdings" w:hint="default"/>
+      </w:rPr>
+    </w:lvl>
+  </w:abstractNum>
+  <w:abstractNum w:abstractNumId="27" w15:restartNumberingAfterBreak="0">
     <w:nsid w:val="62313D22"/>
     <w:multiLevelType w:val="multilevel"/>
     <w:tmpl w:val="FFFFFFFF"/>
@@ -6686,7 +7068,7 @@
       <w:lvlJc w:val="left"/>
     </w:lvl>
   </w:abstractNum>
-  <w:abstractNum w:abstractNumId="25" w15:restartNumberingAfterBreak="0">
+  <w:abstractNum w:abstractNumId="28" w15:restartNumberingAfterBreak="0">
     <w:nsid w:val="647235F1"/>
     <w:multiLevelType w:val="singleLevel"/>
     <w:tmpl w:val="04090001"/>
@@ -6706,7 +7088,96 @@
       </w:rPr>
     </w:lvl>
   </w:abstractNum>
-  <w:abstractNum w:abstractNumId="26" w15:restartNumberingAfterBreak="0">
+  <w:abstractNum w:abstractNumId="29" w15:restartNumberingAfterBreak="0">
+    <w:nsid w:val="68641B48"/>
+    <w:multiLevelType w:val="hybridMultilevel"/>
+    <w:tmpl w:val="904E7D56"/>
+    <w:lvl w:ilvl="0" w:tplc="1009000F">
+      <w:start w:val="1"/>
+      <w:numFmt w:val="decimal"/>
+      <w:lvlText w:val="%1."/>
+      <w:lvlJc w:val="left"/>
+      <w:pPr>
+        <w:ind w:left="720" w:hanging="360"/>
+      </w:pPr>
+      <w:rPr>
+        <w:rFonts w:hint="default"/>
+      </w:rPr>
+    </w:lvl>
+    <w:lvl w:ilvl="1" w:tplc="10090019" w:tentative="1">
+      <w:start w:val="1"/>
+      <w:numFmt w:val="lowerLetter"/>
+      <w:lvlText w:val="%2."/>
+      <w:lvlJc w:val="left"/>
+      <w:pPr>
+        <w:ind w:left="1440" w:hanging="360"/>
+      </w:pPr>
+    </w:lvl>
+    <w:lvl w:ilvl="2" w:tplc="1009001B" w:tentative="1">
+      <w:start w:val="1"/>
+      <w:numFmt w:val="lowerRoman"/>
+      <w:lvlText w:val="%3."/>
+      <w:lvlJc w:val="right"/>
+      <w:pPr>
+        <w:ind w:left="2160" w:hanging="180"/>
+      </w:pPr>
+    </w:lvl>
+    <w:lvl w:ilvl="3" w:tplc="1009000F" w:tentative="1">
+      <w:start w:val="1"/>
+      <w:numFmt w:val="decimal"/>
+      <w:lvlText w:val="%4."/>
+      <w:lvlJc w:val="left"/>
+      <w:pPr>
+        <w:ind w:left="2880" w:hanging="360"/>
+      </w:pPr>
+    </w:lvl>
+    <w:lvl w:ilvl="4" w:tplc="10090019" w:tentative="1">
+      <w:start w:val="1"/>
+      <w:numFmt w:val="lowerLetter"/>
+      <w:lvlText w:val="%5."/>
+      <w:lvlJc w:val="left"/>
+      <w:pPr>
+        <w:ind w:left="3600" w:hanging="360"/>
+      </w:pPr>
+    </w:lvl>
+    <w:lvl w:ilvl="5" w:tplc="1009001B" w:tentative="1">
+      <w:start w:val="1"/>
+      <w:numFmt w:val="lowerRoman"/>
+      <w:lvlText w:val="%6."/>
+      <w:lvlJc w:val="right"/>
+      <w:pPr>
+        <w:ind w:left="4320" w:hanging="180"/>
+      </w:pPr>
+    </w:lvl>
+    <w:lvl w:ilvl="6" w:tplc="1009000F" w:tentative="1">
+      <w:start w:val="1"/>
+      <w:numFmt w:val="decimal"/>
+      <w:lvlText w:val="%7."/>
+      <w:lvlJc w:val="left"/>
+      <w:pPr>
+        <w:ind w:left="5040" w:hanging="360"/>
+      </w:pPr>
+    </w:lvl>
+    <w:lvl w:ilvl="7" w:tplc="10090019" w:tentative="1">
+      <w:start w:val="1"/>
+      <w:numFmt w:val="lowerLetter"/>
+      <w:lvlText w:val="%8."/>
+      <w:lvlJc w:val="left"/>
+      <w:pPr>
+        <w:ind w:left="5760" w:hanging="360"/>
+      </w:pPr>
+    </w:lvl>
+    <w:lvl w:ilvl="8" w:tplc="1009001B" w:tentative="1">
+      <w:start w:val="1"/>
+      <w:numFmt w:val="lowerRoman"/>
+      <w:lvlText w:val="%9."/>
+      <w:lvlJc w:val="right"/>
+      <w:pPr>
+        <w:ind w:left="6480" w:hanging="180"/>
+      </w:pPr>
+    </w:lvl>
+  </w:abstractNum>
+  <w:abstractNum w:abstractNumId="30" w15:restartNumberingAfterBreak="0">
     <w:nsid w:val="6BDF2B1C"/>
     <w:multiLevelType w:val="hybridMultilevel"/>
     <w:tmpl w:val="2C589FAC"/>
@@ -6821,7 +7292,7 @@
       </w:rPr>
     </w:lvl>
   </w:abstractNum>
-  <w:abstractNum w:abstractNumId="27" w15:restartNumberingAfterBreak="0">
+  <w:abstractNum w:abstractNumId="31" w15:restartNumberingAfterBreak="0">
     <w:nsid w:val="6D2F7D46"/>
     <w:multiLevelType w:val="singleLevel"/>
     <w:tmpl w:val="04090001"/>
@@ -6841,7 +7312,7 @@
       </w:rPr>
     </w:lvl>
   </w:abstractNum>
-  <w:abstractNum w:abstractNumId="28" w15:restartNumberingAfterBreak="0">
+  <w:abstractNum w:abstractNumId="32" w15:restartNumberingAfterBreak="0">
     <w:nsid w:val="71F21F2A"/>
     <w:multiLevelType w:val="singleLevel"/>
     <w:tmpl w:val="04090001"/>
@@ -6861,7 +7332,7 @@
       </w:rPr>
     </w:lvl>
   </w:abstractNum>
-  <w:abstractNum w:abstractNumId="29" w15:restartNumberingAfterBreak="0">
+  <w:abstractNum w:abstractNumId="33" w15:restartNumberingAfterBreak="0">
     <w:nsid w:val="743601FB"/>
     <w:multiLevelType w:val="singleLevel"/>
     <w:tmpl w:val="04090001"/>
@@ -6881,7 +7352,7 @@
       </w:rPr>
     </w:lvl>
   </w:abstractNum>
-  <w:abstractNum w:abstractNumId="30" w15:restartNumberingAfterBreak="0">
+  <w:abstractNum w:abstractNumId="34" w15:restartNumberingAfterBreak="0">
     <w:nsid w:val="756150CA"/>
     <w:multiLevelType w:val="singleLevel"/>
     <w:tmpl w:val="04090001"/>
@@ -6901,7 +7372,7 @@
       </w:rPr>
     </w:lvl>
   </w:abstractNum>
-  <w:abstractNum w:abstractNumId="31" w15:restartNumberingAfterBreak="0">
+  <w:abstractNum w:abstractNumId="35" w15:restartNumberingAfterBreak="0">
     <w:nsid w:val="7BE434D7"/>
     <w:multiLevelType w:val="singleLevel"/>
     <w:tmpl w:val="04090001"/>
@@ -6921,7 +7392,7 @@
       </w:rPr>
     </w:lvl>
   </w:abstractNum>
-  <w:abstractNum w:abstractNumId="32" w15:restartNumberingAfterBreak="0">
+  <w:abstractNum w:abstractNumId="36" w15:restartNumberingAfterBreak="0">
     <w:nsid w:val="7C9362FF"/>
     <w:multiLevelType w:val="hybridMultilevel"/>
     <w:tmpl w:val="23B07F92"/>
@@ -7061,7 +7532,7 @@
       </w:rPr>
     </w:lvl>
   </w:abstractNum>
-  <w:abstractNum w:abstractNumId="33" w15:restartNumberingAfterBreak="0">
+  <w:abstractNum w:abstractNumId="37" w15:restartNumberingAfterBreak="0">
     <w:nsid w:val="7F0F4592"/>
     <w:multiLevelType w:val="hybridMultilevel"/>
     <w:tmpl w:val="AEA4742E"/>
@@ -7174,10 +7645,10 @@
       </w:rPr>
     </w:lvl>
   </w:abstractNum>
-  <w:num w:numId="1">
+  <w:num w:numId="1" w16cid:durableId="1196776724">
     <w:abstractNumId w:val="0"/>
   </w:num>
-  <w:num w:numId="2">
+  <w:num w:numId="2" w16cid:durableId="1248617392">
     <w:abstractNumId w:val="1"/>
     <w:lvlOverride w:ilvl="0">
       <w:lvl w:ilvl="0">
@@ -7195,22 +7666,22 @@
       </w:lvl>
     </w:lvlOverride>
   </w:num>
-  <w:num w:numId="3">
+  <w:num w:numId="3" w16cid:durableId="361369622">
     <w:abstractNumId w:val="3"/>
   </w:num>
-  <w:num w:numId="4">
-    <w:abstractNumId w:val="13"/>
+  <w:num w:numId="4" w16cid:durableId="1148480374">
+    <w:abstractNumId w:val="14"/>
   </w:num>
-  <w:num w:numId="5">
-    <w:abstractNumId w:val="31"/>
+  <w:num w:numId="5" w16cid:durableId="62069998">
+    <w:abstractNumId w:val="35"/>
   </w:num>
-  <w:num w:numId="6">
-    <w:abstractNumId w:val="21"/>
+  <w:num w:numId="6" w16cid:durableId="1763066981">
+    <w:abstractNumId w:val="23"/>
   </w:num>
-  <w:num w:numId="7">
-    <w:abstractNumId w:val="20"/>
+  <w:num w:numId="7" w16cid:durableId="66074496">
+    <w:abstractNumId w:val="22"/>
   </w:num>
-  <w:num w:numId="8">
+  <w:num w:numId="8" w16cid:durableId="306937487">
     <w:abstractNumId w:val="1"/>
     <w:lvlOverride w:ilvl="0">
       <w:lvl w:ilvl="0">
@@ -7227,85 +7698,85 @@
       </w:lvl>
     </w:lvlOverride>
   </w:num>
-  <w:num w:numId="9">
+  <w:num w:numId="9" w16cid:durableId="406459258">
     <w:abstractNumId w:val="2"/>
   </w:num>
-  <w:num w:numId="10">
+  <w:num w:numId="10" w16cid:durableId="476801821">
+    <w:abstractNumId w:val="34"/>
+  </w:num>
+  <w:num w:numId="11" w16cid:durableId="1830949252">
+    <w:abstractNumId w:val="4"/>
+  </w:num>
+  <w:num w:numId="12" w16cid:durableId="418796000">
+    <w:abstractNumId w:val="15"/>
+  </w:num>
+  <w:num w:numId="13" w16cid:durableId="1087534895">
+    <w:abstractNumId w:val="13"/>
+  </w:num>
+  <w:num w:numId="14" w16cid:durableId="877283331">
+    <w:abstractNumId w:val="33"/>
+  </w:num>
+  <w:num w:numId="15" w16cid:durableId="1800800220">
+    <w:abstractNumId w:val="12"/>
+  </w:num>
+  <w:num w:numId="16" w16cid:durableId="1388455006">
+    <w:abstractNumId w:val="5"/>
+  </w:num>
+  <w:num w:numId="17" w16cid:durableId="747658194">
+    <w:abstractNumId w:val="32"/>
+  </w:num>
+  <w:num w:numId="18" w16cid:durableId="1798988964">
+    <w:abstractNumId w:val="20"/>
+  </w:num>
+  <w:num w:numId="19" w16cid:durableId="941760274">
+    <w:abstractNumId w:val="6"/>
+  </w:num>
+  <w:num w:numId="20" w16cid:durableId="776219260">
+    <w:abstractNumId w:val="18"/>
+  </w:num>
+  <w:num w:numId="21" w16cid:durableId="550727769">
+    <w:abstractNumId w:val="11"/>
+  </w:num>
+  <w:num w:numId="22" w16cid:durableId="1025718526">
+    <w:abstractNumId w:val="31"/>
+  </w:num>
+  <w:num w:numId="23" w16cid:durableId="1297376522">
+    <w:abstractNumId w:val="9"/>
+  </w:num>
+  <w:num w:numId="24" w16cid:durableId="821431343">
+    <w:abstractNumId w:val="8"/>
+  </w:num>
+  <w:num w:numId="25" w16cid:durableId="876703565">
+    <w:abstractNumId w:val="7"/>
+  </w:num>
+  <w:num w:numId="26" w16cid:durableId="393743212">
+    <w:abstractNumId w:val="25"/>
+  </w:num>
+  <w:num w:numId="27" w16cid:durableId="1754737855">
+    <w:abstractNumId w:val="28"/>
+  </w:num>
+  <w:num w:numId="28" w16cid:durableId="2143376198">
+    <w:abstractNumId w:val="36"/>
+  </w:num>
+  <w:num w:numId="29" w16cid:durableId="1456020425">
+    <w:abstractNumId w:val="16"/>
+  </w:num>
+  <w:num w:numId="30" w16cid:durableId="1175343395">
+    <w:abstractNumId w:val="17"/>
+  </w:num>
+  <w:num w:numId="31" w16cid:durableId="15861038">
     <w:abstractNumId w:val="30"/>
   </w:num>
-  <w:num w:numId="11">
-    <w:abstractNumId w:val="4"/>
+  <w:num w:numId="32" w16cid:durableId="972948544">
+    <w:abstractNumId w:val="37"/>
   </w:num>
-  <w:num w:numId="12">
-    <w:abstractNumId w:val="14"/>
+  <w:num w:numId="33" w16cid:durableId="2107656067">
+    <w:abstractNumId w:val="21"/>
   </w:num>
-  <w:num w:numId="13">
-    <w:abstractNumId w:val="12"/>
+  <w:num w:numId="34" w16cid:durableId="1828479391">
+    <w:abstractNumId w:val="24"/>
   </w:num>
-  <w:num w:numId="14">
-    <w:abstractNumId w:val="29"/>
-  </w:num>
-  <w:num w:numId="15">
-    <w:abstractNumId w:val="11"/>
-  </w:num>
-  <w:num w:numId="16">
-    <w:abstractNumId w:val="5"/>
-  </w:num>
-  <w:num w:numId="17">
-    <w:abstractNumId w:val="28"/>
-  </w:num>
-  <w:num w:numId="18">
-    <w:abstractNumId w:val="18"/>
-  </w:num>
-  <w:num w:numId="19">
-    <w:abstractNumId w:val="6"/>
-  </w:num>
-  <w:num w:numId="20">
-    <w:abstractNumId w:val="17"/>
-  </w:num>
-  <w:num w:numId="21">
-    <w:abstractNumId w:val="10"/>
-  </w:num>
-  <w:num w:numId="22">
-    <w:abstractNumId w:val="27"/>
-  </w:num>
-  <w:num w:numId="23">
-    <w:abstractNumId w:val="9"/>
-  </w:num>
-  <w:num w:numId="24">
-    <w:abstractNumId w:val="8"/>
-  </w:num>
-  <w:num w:numId="25">
-    <w:abstractNumId w:val="7"/>
-  </w:num>
-  <w:num w:numId="26">
-    <w:abstractNumId w:val="23"/>
-  </w:num>
-  <w:num w:numId="27">
-    <w:abstractNumId w:val="25"/>
-  </w:num>
-  <w:num w:numId="28">
-    <w:abstractNumId w:val="32"/>
-  </w:num>
-  <w:num w:numId="29">
-    <w:abstractNumId w:val="15"/>
-  </w:num>
-  <w:num w:numId="30">
-    <w:abstractNumId w:val="16"/>
-  </w:num>
-  <w:num w:numId="31">
-    <w:abstractNumId w:val="26"/>
-  </w:num>
-  <w:num w:numId="32">
-    <w:abstractNumId w:val="33"/>
-  </w:num>
-  <w:num w:numId="33">
-    <w:abstractNumId w:val="19"/>
-  </w:num>
-  <w:num w:numId="34">
-    <w:abstractNumId w:val="22"/>
-  </w:num>
-  <w:num w:numId="35">
+  <w:num w:numId="35" w16cid:durableId="1467695428">
     <w:abstractNumId w:val="0"/>
     <w:lvlOverride w:ilvl="0">
       <w:startOverride w:val="1"/>
@@ -7335,7 +7806,7 @@
       <w:startOverride w:val="1"/>
     </w:lvlOverride>
   </w:num>
-  <w:num w:numId="36">
+  <w:num w:numId="36" w16cid:durableId="2039504916">
     <w:abstractNumId w:val="0"/>
     <w:lvlOverride w:ilvl="0">
       <w:startOverride w:val="3"/>
@@ -7344,14 +7815,26 @@
       <w:startOverride w:val="1"/>
     </w:lvlOverride>
   </w:num>
-  <w:num w:numId="37">
-    <w:abstractNumId w:val="24"/>
+  <w:num w:numId="37" w16cid:durableId="521364003">
+    <w:abstractNumId w:val="27"/>
+  </w:num>
+  <w:num w:numId="38" w16cid:durableId="787162840">
+    <w:abstractNumId w:val="10"/>
+  </w:num>
+  <w:num w:numId="39" w16cid:durableId="1253390644">
+    <w:abstractNumId w:val="26"/>
+  </w:num>
+  <w:num w:numId="40" w16cid:durableId="2053725738">
+    <w:abstractNumId w:val="29"/>
+  </w:num>
+  <w:num w:numId="41" w16cid:durableId="462112516">
+    <w:abstractNumId w:val="19"/>
   </w:num>
 </w:numbering>
 </file>
 
 <file path=word/styles.xml><?xml version="1.0" encoding="utf-8"?>
-<w:styles xmlns:mc="http://schemas.openxmlformats.org/markup-compatibility/2006" xmlns:r="http://schemas.openxmlformats.org/officeDocument/2006/relationships" xmlns:w="http://schemas.openxmlformats.org/wordprocessingml/2006/main" xmlns:w14="http://schemas.microsoft.com/office/word/2010/wordml" xmlns:w15="http://schemas.microsoft.com/office/word/2012/wordml" xmlns:w16cex="http://schemas.microsoft.com/office/word/2018/wordml/cex" xmlns:w16cid="http://schemas.microsoft.com/office/word/2016/wordml/cid" xmlns:w16="http://schemas.microsoft.com/office/word/2018/wordml" xmlns:w16se="http://schemas.microsoft.com/office/word/2015/wordml/symex" mc:Ignorable="w14 w15 w16se w16cid w16 w16cex">
+<w:styles xmlns:mc="http://schemas.openxmlformats.org/markup-compatibility/2006" xmlns:r="http://schemas.openxmlformats.org/officeDocument/2006/relationships" xmlns:w="http://schemas.openxmlformats.org/wordprocessingml/2006/main" xmlns:w14="http://schemas.microsoft.com/office/word/2010/wordml" xmlns:w15="http://schemas.microsoft.com/office/word/2012/wordml" xmlns:w16cex="http://schemas.microsoft.com/office/word/2018/wordml/cex" xmlns:w16cid="http://schemas.microsoft.com/office/word/2016/wordml/cid" xmlns:w16="http://schemas.microsoft.com/office/word/2018/wordml" xmlns:w16du="http://schemas.microsoft.com/office/word/2023/wordml/word16du" xmlns:w16sdtdh="http://schemas.microsoft.com/office/word/2020/wordml/sdtdatahash" xmlns:w16sdtfl="http://schemas.microsoft.com/office/word/2024/wordml/sdtformatlock" xmlns:w16se="http://schemas.microsoft.com/office/word/2015/wordml/symex" mc:Ignorable="w14 w15 w16se w16cid w16 w16cex w16sdtdh w16sdtfl w16du">
   <w:docDefaults>
     <w:rPrDefault>
       <w:rPr>
@@ -7814,7 +8297,6 @@
   <w:style w:type="character" w:default="1" w:styleId="DefaultParagraphFont">
     <w:name w:val="Default Paragraph Font"/>
     <w:uiPriority w:val="1"/>
-    <w:semiHidden/>
     <w:unhideWhenUsed/>
   </w:style>
   <w:style w:type="table" w:default="1" w:styleId="TableNormal">
@@ -8340,6 +8822,17 @@
       </w:tblBorders>
     </w:tblPr>
   </w:style>
+  <w:style w:type="paragraph" w:styleId="ListParagraph">
+    <w:name w:val="List Paragraph"/>
+    <w:basedOn w:val="Normal"/>
+    <w:uiPriority w:val="34"/>
+    <w:qFormat/>
+    <w:rsid w:val="00F76599"/>
+    <w:pPr>
+      <w:ind w:left="720"/>
+      <w:contextualSpacing/>
+    </w:pPr>
+  </w:style>
 </w:styles>
 </file>
 

</xml_diff>